<commit_message>
Rewrite bid document sections to align with dental O&M project front matter
Agent-Logs-Url: https://github.com/gjyhj1234/-/sessions/1fe4c5ae-6d9f-4367-a3bf-22bec46b11fe

Co-authored-by: gjyhj1234 <6868698+gjyhj1234@users.noreply.github.com>
</commit_message>
<xml_diff>
--- a/义齿加工系统运维服务需求相关文件-2.docx
+++ b/义齿加工系统运维服务需求相关文件-2.docx
@@ -16038,22 +16038,8 @@
             <w:vAlign w:val="center"/>
           </w:tcPr>
           <w:p>
-            <w:pPr>
-              <w:widowControl/>
-              <w:jc w:val="left"/>
-              <w:rPr>
-                <w:rFonts w:ascii="仿宋" w:hAnsi="仿宋" w:eastAsia="仿宋" w:cs="宋体"/>
-                <w:kern w:val="0"/>
-                <w:szCs w:val="21"/>
-              </w:rPr>
-            </w:pPr>
-            <w:r>
-              <w:rPr>
-                <w:rFonts w:ascii="仿宋" w:hAnsi="仿宋" w:eastAsia="仿宋" w:cs="宋体"/>
-                <w:kern w:val="0"/>
-                <w:szCs w:val="21"/>
-              </w:rPr>
-              <w:t>活性炭过滤器</w:t>
+            <w:r>
+              <w:t>义齿加工系统运维服务</w:t>
             </w:r>
           </w:p>
         </w:tc>
@@ -16069,22 +16055,8 @@
             <w:vAlign w:val="center"/>
           </w:tcPr>
           <w:p>
-            <w:pPr>
-              <w:widowControl/>
-              <w:jc w:val="left"/>
-              <w:rPr>
-                <w:rFonts w:ascii="仿宋" w:hAnsi="仿宋" w:eastAsia="仿宋" w:cs="宋体"/>
-                <w:kern w:val="0"/>
-                <w:szCs w:val="21"/>
-              </w:rPr>
-            </w:pPr>
-            <w:r>
-              <w:rPr>
-                <w:rFonts w:ascii="仿宋" w:hAnsi="仿宋" w:eastAsia="仿宋" w:cs="宋体"/>
-                <w:kern w:val="0"/>
-                <w:szCs w:val="21"/>
-              </w:rPr>
-              <w:t>495×550×320mm</w:t>
+            <w:r>
+              <w:t>按比选文件"五、服务内容及服务范围"提供义齿加工系统的软件开发、维护、数据库运维（监控/性能调优/存储空间管理/独立增量备份/跨院区加密备份）、数据集成引擎与数据中心数据维护、数据审计与纠错、应用运维与BUG修复、系统培训等服务</w:t>
             </w:r>
           </w:p>
         </w:tc>
@@ -16100,22 +16072,8 @@
             <w:vAlign w:val="center"/>
           </w:tcPr>
           <w:p>
-            <w:pPr>
-              <w:widowControl/>
-              <w:jc w:val="left"/>
-              <w:rPr>
-                <w:rFonts w:ascii="仿宋" w:hAnsi="仿宋" w:eastAsia="仿宋" w:cs="宋体"/>
-                <w:kern w:val="0"/>
-                <w:szCs w:val="21"/>
-              </w:rPr>
-            </w:pPr>
-            <w:r>
-              <w:rPr>
-                <w:rFonts w:ascii="仿宋" w:hAnsi="仿宋" w:eastAsia="仿宋" w:cs="宋体"/>
-                <w:kern w:val="0"/>
-                <w:szCs w:val="21"/>
-              </w:rPr>
-              <w:t>3套/年</w:t>
+            <w:r>
+              <w:t>1年</w:t>
             </w:r>
           </w:p>
         </w:tc>
@@ -16131,15 +16089,7 @@
             <w:vAlign w:val="center"/>
           </w:tcPr>
           <w:p>
-            <w:pPr>
-              <w:widowControl/>
-              <w:jc w:val="left"/>
-              <w:rPr>
-                <w:rFonts w:ascii="仿宋" w:hAnsi="仿宋" w:eastAsia="仿宋" w:cs="宋体"/>
-                <w:kern w:val="0"/>
-                <w:szCs w:val="21"/>
-              </w:rPr>
-            </w:pPr>
+            <w:r/>
           </w:p>
         </w:tc>
         <w:tc>
@@ -16154,15 +16104,7 @@
             <w:vAlign w:val="center"/>
           </w:tcPr>
           <w:p>
-            <w:pPr>
-              <w:widowControl/>
-              <w:jc w:val="left"/>
-              <w:rPr>
-                <w:rFonts w:ascii="仿宋" w:hAnsi="仿宋" w:eastAsia="仿宋"/>
-                <w:kern w:val="0"/>
-                <w:szCs w:val="21"/>
-              </w:rPr>
-            </w:pPr>
+            <w:r/>
           </w:p>
         </w:tc>
         <w:tc>
@@ -16177,22 +16119,8 @@
             <w:vAlign w:val="center"/>
           </w:tcPr>
           <w:p>
-            <w:pPr>
-              <w:widowControl/>
-              <w:jc w:val="left"/>
-              <w:rPr>
-                <w:rFonts w:ascii="仿宋" w:hAnsi="仿宋" w:eastAsia="仿宋" w:cs="宋体"/>
-                <w:kern w:val="0"/>
-                <w:szCs w:val="21"/>
-              </w:rPr>
-            </w:pPr>
-            <w:r>
-              <w:rPr>
-                <w:rFonts w:ascii="仿宋" w:hAnsi="仿宋" w:eastAsia="仿宋" w:cs="宋体"/>
-                <w:kern w:val="0"/>
-                <w:szCs w:val="21"/>
-              </w:rPr>
-              <w:t>块状活性炭，具有吸附过滤功效</w:t>
+            <w:r>
+              <w:t>总价包干，含人工、差旅、税费等一切费用</w:t>
             </w:r>
           </w:p>
         </w:tc>
@@ -16226,23 +16154,7 @@
             <w:vAlign w:val="center"/>
           </w:tcPr>
           <w:p>
-            <w:pPr>
-              <w:widowControl/>
-              <w:jc w:val="left"/>
-              <w:rPr>
-                <w:rFonts w:ascii="仿宋" w:hAnsi="仿宋" w:eastAsia="仿宋" w:cs="宋体"/>
-                <w:kern w:val="0"/>
-                <w:szCs w:val="21"/>
-              </w:rPr>
-            </w:pPr>
-            <w:r>
-              <w:rPr>
-                <w:rFonts w:ascii="仿宋" w:hAnsi="仿宋" w:eastAsia="仿宋" w:cs="宋体"/>
-                <w:kern w:val="0"/>
-                <w:szCs w:val="21"/>
-              </w:rPr>
-              <w:t>初效过滤器</w:t>
-            </w:r>
+            <w:r/>
           </w:p>
         </w:tc>
         <w:tc>
@@ -16257,23 +16169,7 @@
             <w:vAlign w:val="center"/>
           </w:tcPr>
           <w:p>
-            <w:pPr>
-              <w:widowControl/>
-              <w:jc w:val="left"/>
-              <w:rPr>
-                <w:rFonts w:ascii="仿宋" w:hAnsi="仿宋" w:eastAsia="仿宋" w:cs="宋体"/>
-                <w:kern w:val="0"/>
-                <w:szCs w:val="21"/>
-              </w:rPr>
-            </w:pPr>
-            <w:r>
-              <w:rPr>
-                <w:rFonts w:ascii="仿宋" w:hAnsi="仿宋" w:eastAsia="仿宋" w:cs="宋体"/>
-                <w:kern w:val="0"/>
-                <w:szCs w:val="21"/>
-              </w:rPr>
-              <w:t>由参选人根据现场踏勘或经验填报</w:t>
-            </w:r>
+            <w:r/>
           </w:p>
         </w:tc>
         <w:tc>
@@ -16288,23 +16184,7 @@
             <w:vAlign w:val="center"/>
           </w:tcPr>
           <w:p>
-            <w:pPr>
-              <w:widowControl/>
-              <w:jc w:val="left"/>
-              <w:rPr>
-                <w:rFonts w:ascii="仿宋" w:hAnsi="仿宋" w:eastAsia="仿宋" w:cs="宋体"/>
-                <w:kern w:val="0"/>
-                <w:szCs w:val="21"/>
-              </w:rPr>
-            </w:pPr>
-            <w:r>
-              <w:rPr>
-                <w:rFonts w:ascii="仿宋" w:hAnsi="仿宋" w:eastAsia="仿宋" w:cs="宋体"/>
-                <w:kern w:val="0"/>
-                <w:szCs w:val="21"/>
-              </w:rPr>
-              <w:t>1批/年</w:t>
-            </w:r>
+            <w:r/>
           </w:p>
         </w:tc>
         <w:tc>
@@ -16319,15 +16199,7 @@
             <w:vAlign w:val="center"/>
           </w:tcPr>
           <w:p>
-            <w:pPr>
-              <w:widowControl/>
-              <w:jc w:val="left"/>
-              <w:rPr>
-                <w:rFonts w:ascii="仿宋" w:hAnsi="仿宋" w:eastAsia="仿宋" w:cs="宋体"/>
-                <w:kern w:val="0"/>
-                <w:szCs w:val="21"/>
-              </w:rPr>
-            </w:pPr>
+            <w:r/>
           </w:p>
         </w:tc>
         <w:tc>
@@ -16342,15 +16214,7 @@
             <w:vAlign w:val="center"/>
           </w:tcPr>
           <w:p>
-            <w:pPr>
-              <w:widowControl/>
-              <w:jc w:val="left"/>
-              <w:rPr>
-                <w:rFonts w:ascii="仿宋" w:hAnsi="仿宋" w:eastAsia="仿宋"/>
-                <w:kern w:val="0"/>
-                <w:szCs w:val="21"/>
-              </w:rPr>
-            </w:pPr>
+            <w:r/>
           </w:p>
         </w:tc>
         <w:tc>
@@ -16365,24 +16229,7 @@
             <w:vAlign w:val="center"/>
           </w:tcPr>
           <w:p>
-            <w:pPr>
-              <w:widowControl/>
-              <w:jc w:val="left"/>
-              <w:rPr>
-                <w:rFonts w:ascii="仿宋" w:hAnsi="仿宋" w:eastAsia="仿宋" w:cs="宋体"/>
-                <w:kern w:val="0"/>
-                <w:szCs w:val="21"/>
-              </w:rPr>
-            </w:pPr>
-            <w:r>
-              <w:rPr>
-                <w:rFonts w:ascii="仿宋" w:hAnsi="仿宋" w:eastAsia="仿宋" w:cs="宋体"/>
-                <w:bCs/>
-                <w:kern w:val="0"/>
-                <w:szCs w:val="21"/>
-              </w:rPr>
-              <w:t>价格已包含在总价内</w:t>
-            </w:r>
+            <w:r/>
           </w:p>
         </w:tc>
       </w:tr>
@@ -16415,23 +16262,7 @@
             <w:vAlign w:val="center"/>
           </w:tcPr>
           <w:p>
-            <w:pPr>
-              <w:widowControl/>
-              <w:jc w:val="left"/>
-              <w:rPr>
-                <w:rFonts w:ascii="仿宋" w:hAnsi="仿宋" w:eastAsia="仿宋" w:cs="宋体"/>
-                <w:kern w:val="0"/>
-                <w:szCs w:val="21"/>
-              </w:rPr>
-            </w:pPr>
-            <w:r>
-              <w:rPr>
-                <w:rFonts w:ascii="仿宋" w:hAnsi="仿宋" w:eastAsia="仿宋" w:cs="宋体"/>
-                <w:kern w:val="0"/>
-                <w:szCs w:val="21"/>
-              </w:rPr>
-              <w:t>中效过滤器</w:t>
-            </w:r>
+            <w:r/>
           </w:p>
         </w:tc>
         <w:tc>
@@ -16446,23 +16277,7 @@
             <w:vAlign w:val="center"/>
           </w:tcPr>
           <w:p>
-            <w:pPr>
-              <w:widowControl/>
-              <w:jc w:val="left"/>
-              <w:rPr>
-                <w:rFonts w:ascii="仿宋" w:hAnsi="仿宋" w:eastAsia="仿宋" w:cs="宋体"/>
-                <w:kern w:val="0"/>
-                <w:szCs w:val="21"/>
-              </w:rPr>
-            </w:pPr>
-            <w:r>
-              <w:rPr>
-                <w:rFonts w:ascii="仿宋" w:hAnsi="仿宋" w:eastAsia="仿宋" w:cs="宋体"/>
-                <w:kern w:val="0"/>
-                <w:szCs w:val="21"/>
-              </w:rPr>
-              <w:t>由参选人根据现场踏勘或经验填报</w:t>
-            </w:r>
+            <w:r/>
           </w:p>
         </w:tc>
         <w:tc>
@@ -16477,23 +16292,7 @@
             <w:vAlign w:val="center"/>
           </w:tcPr>
           <w:p>
-            <w:pPr>
-              <w:widowControl/>
-              <w:jc w:val="left"/>
-              <w:rPr>
-                <w:rFonts w:ascii="仿宋" w:hAnsi="仿宋" w:eastAsia="仿宋" w:cs="宋体"/>
-                <w:kern w:val="0"/>
-                <w:szCs w:val="21"/>
-              </w:rPr>
-            </w:pPr>
-            <w:r>
-              <w:rPr>
-                <w:rFonts w:ascii="仿宋" w:hAnsi="仿宋" w:eastAsia="仿宋" w:cs="宋体"/>
-                <w:kern w:val="0"/>
-                <w:szCs w:val="21"/>
-              </w:rPr>
-              <w:t>1批/年</w:t>
-            </w:r>
+            <w:r/>
           </w:p>
         </w:tc>
         <w:tc>
@@ -16508,15 +16307,7 @@
             <w:vAlign w:val="center"/>
           </w:tcPr>
           <w:p>
-            <w:pPr>
-              <w:widowControl/>
-              <w:jc w:val="left"/>
-              <w:rPr>
-                <w:rFonts w:ascii="仿宋" w:hAnsi="仿宋" w:eastAsia="仿宋" w:cs="宋体"/>
-                <w:kern w:val="0"/>
-                <w:szCs w:val="21"/>
-              </w:rPr>
-            </w:pPr>
+            <w:r/>
           </w:p>
         </w:tc>
         <w:tc>
@@ -16531,15 +16322,7 @@
             <w:vAlign w:val="center"/>
           </w:tcPr>
           <w:p>
-            <w:pPr>
-              <w:widowControl/>
-              <w:jc w:val="left"/>
-              <w:rPr>
-                <w:rFonts w:ascii="仿宋" w:hAnsi="仿宋" w:eastAsia="仿宋"/>
-                <w:kern w:val="0"/>
-                <w:szCs w:val="21"/>
-              </w:rPr>
-            </w:pPr>
+            <w:r/>
           </w:p>
         </w:tc>
         <w:tc>
@@ -16554,24 +16337,7 @@
             <w:vAlign w:val="center"/>
           </w:tcPr>
           <w:p>
-            <w:pPr>
-              <w:widowControl/>
-              <w:jc w:val="left"/>
-              <w:rPr>
-                <w:rFonts w:ascii="仿宋" w:hAnsi="仿宋" w:eastAsia="仿宋" w:cs="宋体"/>
-                <w:kern w:val="0"/>
-                <w:szCs w:val="21"/>
-              </w:rPr>
-            </w:pPr>
-            <w:r>
-              <w:rPr>
-                <w:rFonts w:ascii="仿宋" w:hAnsi="仿宋" w:eastAsia="仿宋" w:cs="宋体"/>
-                <w:bCs/>
-                <w:kern w:val="0"/>
-                <w:szCs w:val="21"/>
-              </w:rPr>
-              <w:t>价格已包含在总价内</w:t>
-            </w:r>
+            <w:r/>
           </w:p>
         </w:tc>
       </w:tr>
@@ -16604,23 +16370,7 @@
             <w:vAlign w:val="center"/>
           </w:tcPr>
           <w:p>
-            <w:pPr>
-              <w:widowControl/>
-              <w:jc w:val="left"/>
-              <w:rPr>
-                <w:rFonts w:ascii="仿宋" w:hAnsi="仿宋" w:eastAsia="仿宋" w:cs="宋体"/>
-                <w:kern w:val="0"/>
-                <w:szCs w:val="21"/>
-              </w:rPr>
-            </w:pPr>
-            <w:r>
-              <w:rPr>
-                <w:rFonts w:ascii="仿宋" w:hAnsi="仿宋" w:eastAsia="仿宋" w:cs="宋体"/>
-                <w:kern w:val="0"/>
-                <w:szCs w:val="21"/>
-              </w:rPr>
-              <w:t>维修保养服务费</w:t>
-            </w:r>
+            <w:r/>
           </w:p>
         </w:tc>
         <w:tc>
@@ -16635,23 +16385,7 @@
             <w:vAlign w:val="center"/>
           </w:tcPr>
           <w:p>
-            <w:pPr>
-              <w:widowControl/>
-              <w:jc w:val="left"/>
-              <w:rPr>
-                <w:rFonts w:ascii="仿宋" w:hAnsi="仿宋" w:eastAsia="仿宋" w:cs="宋体"/>
-                <w:kern w:val="0"/>
-                <w:szCs w:val="21"/>
-              </w:rPr>
-            </w:pPr>
-            <w:r>
-              <w:rPr>
-                <w:rFonts w:ascii="仿宋" w:hAnsi="仿宋" w:eastAsia="仿宋" w:cs="宋体"/>
-                <w:kern w:val="0"/>
-                <w:szCs w:val="21"/>
-              </w:rPr>
-              <w:t>含人工、运输、保险、安全等</w:t>
-            </w:r>
+            <w:r/>
           </w:p>
         </w:tc>
         <w:tc>
@@ -16666,23 +16400,7 @@
             <w:vAlign w:val="center"/>
           </w:tcPr>
           <w:p>
-            <w:pPr>
-              <w:widowControl/>
-              <w:jc w:val="left"/>
-              <w:rPr>
-                <w:rFonts w:ascii="仿宋" w:hAnsi="仿宋" w:eastAsia="仿宋" w:cs="宋体"/>
-                <w:kern w:val="0"/>
-                <w:szCs w:val="21"/>
-              </w:rPr>
-            </w:pPr>
-            <w:r>
-              <w:rPr>
-                <w:rFonts w:ascii="仿宋" w:hAnsi="仿宋" w:eastAsia="仿宋" w:cs="宋体"/>
-                <w:kern w:val="0"/>
-                <w:szCs w:val="21"/>
-              </w:rPr>
-              <w:t>1年</w:t>
-            </w:r>
+            <w:r/>
           </w:p>
         </w:tc>
         <w:tc>
@@ -16697,15 +16415,7 @@
             <w:vAlign w:val="center"/>
           </w:tcPr>
           <w:p>
-            <w:pPr>
-              <w:widowControl/>
-              <w:jc w:val="left"/>
-              <w:rPr>
-                <w:rFonts w:ascii="仿宋" w:hAnsi="仿宋" w:eastAsia="仿宋" w:cs="宋体"/>
-                <w:kern w:val="0"/>
-                <w:szCs w:val="21"/>
-              </w:rPr>
-            </w:pPr>
+            <w:r/>
           </w:p>
         </w:tc>
         <w:tc>
@@ -16720,15 +16430,7 @@
             <w:vAlign w:val="center"/>
           </w:tcPr>
           <w:p>
-            <w:pPr>
-              <w:widowControl/>
-              <w:jc w:val="left"/>
-              <w:rPr>
-                <w:rFonts w:ascii="仿宋" w:hAnsi="仿宋" w:eastAsia="仿宋"/>
-                <w:kern w:val="0"/>
-                <w:szCs w:val="21"/>
-              </w:rPr>
-            </w:pPr>
+            <w:r/>
           </w:p>
         </w:tc>
         <w:tc>
@@ -16743,24 +16445,7 @@
             <w:vAlign w:val="center"/>
           </w:tcPr>
           <w:p>
-            <w:pPr>
-              <w:widowControl/>
-              <w:jc w:val="left"/>
-              <w:rPr>
-                <w:rFonts w:ascii="仿宋" w:hAnsi="仿宋" w:eastAsia="仿宋" w:cs="宋体"/>
-                <w:kern w:val="0"/>
-                <w:szCs w:val="21"/>
-              </w:rPr>
-            </w:pPr>
-            <w:r>
-              <w:rPr>
-                <w:rFonts w:ascii="仿宋" w:hAnsi="仿宋" w:eastAsia="仿宋" w:cs="宋体"/>
-                <w:bCs/>
-                <w:kern w:val="0"/>
-                <w:szCs w:val="21"/>
-              </w:rPr>
-              <w:t>价格已包含在总价内</w:t>
-            </w:r>
+            <w:r/>
           </w:p>
         </w:tc>
       </w:tr>
@@ -16793,22 +16478,7 @@
             <w:vAlign w:val="center"/>
           </w:tcPr>
           <w:p>
-            <w:pPr>
-              <w:widowControl/>
-              <w:jc w:val="left"/>
-              <w:rPr>
-                <w:rFonts w:ascii="仿宋" w:hAnsi="仿宋" w:eastAsia="仿宋" w:cs="宋体"/>
-                <w:kern w:val="0"/>
-                <w:szCs w:val="21"/>
-              </w:rPr>
-            </w:pPr>
-            <w:r>
-              <w:rPr>
-                <w:rFonts w:ascii="仿宋" w:hAnsi="仿宋" w:eastAsia="仿宋" w:cs="宋体"/>
-                <w:bCs/>
-                <w:kern w:val="0"/>
-                <w:szCs w:val="21"/>
-              </w:rPr>
+            <w:r>
               <w:t>年度总报价（即总价包干价）</w:t>
             </w:r>
           </w:p>
@@ -16825,15 +16495,7 @@
             <w:vAlign w:val="center"/>
           </w:tcPr>
           <w:p>
-            <w:pPr>
-              <w:widowControl/>
-              <w:jc w:val="left"/>
-              <w:rPr>
-                <w:rFonts w:ascii="仿宋" w:hAnsi="仿宋" w:eastAsia="仿宋" w:cs="宋体"/>
-                <w:kern w:val="0"/>
-                <w:szCs w:val="21"/>
-              </w:rPr>
-            </w:pPr>
+            <w:r/>
           </w:p>
         </w:tc>
         <w:tc>
@@ -16848,15 +16510,7 @@
             <w:vAlign w:val="center"/>
           </w:tcPr>
           <w:p>
-            <w:pPr>
-              <w:widowControl/>
-              <w:jc w:val="left"/>
-              <w:rPr>
-                <w:rFonts w:ascii="仿宋" w:hAnsi="仿宋" w:eastAsia="仿宋"/>
-                <w:kern w:val="0"/>
-                <w:szCs w:val="21"/>
-              </w:rPr>
-            </w:pPr>
+            <w:r/>
           </w:p>
         </w:tc>
         <w:tc>
@@ -16871,15 +16525,7 @@
             <w:vAlign w:val="center"/>
           </w:tcPr>
           <w:p>
-            <w:pPr>
-              <w:widowControl/>
-              <w:jc w:val="left"/>
-              <w:rPr>
-                <w:rFonts w:ascii="仿宋" w:hAnsi="仿宋" w:eastAsia="仿宋"/>
-                <w:kern w:val="0"/>
-                <w:szCs w:val="21"/>
-              </w:rPr>
-            </w:pPr>
+            <w:r/>
           </w:p>
         </w:tc>
         <w:tc>
@@ -16894,41 +16540,8 @@
             <w:vAlign w:val="center"/>
           </w:tcPr>
           <w:p>
-            <w:pPr>
-              <w:widowControl/>
-              <w:jc w:val="left"/>
-              <w:rPr>
-                <w:rFonts w:ascii="仿宋" w:hAnsi="仿宋" w:eastAsia="仿宋" w:cs="宋体"/>
-                <w:kern w:val="0"/>
-                <w:szCs w:val="21"/>
-              </w:rPr>
-            </w:pPr>
-            <w:r>
-              <w:rPr>
-                <w:rFonts w:ascii="仿宋" w:hAnsi="仿宋" w:eastAsia="仿宋" w:cs="宋体"/>
-                <w:bCs/>
-                <w:kern w:val="0"/>
-                <w:szCs w:val="21"/>
-              </w:rPr>
-              <w:t>（</w:t>
-            </w:r>
-            <w:r>
-              <w:rPr>
-                <w:rFonts w:ascii="Calibri" w:hAnsi="Calibri" w:eastAsia="仿宋" w:cs="Calibri"/>
-                <w:bCs/>
-                <w:kern w:val="0"/>
-                <w:szCs w:val="21"/>
-              </w:rPr>
-              <w:t>¥</w:t>
-            </w:r>
-            <w:r>
-              <w:rPr>
-                <w:rFonts w:ascii="仿宋" w:hAnsi="仿宋" w:eastAsia="仿宋" w:cs="宋体"/>
-                <w:bCs/>
-                <w:kern w:val="0"/>
-                <w:szCs w:val="21"/>
-              </w:rPr>
-              <w:t>______元）</w:t>
+            <w:r>
+              <w:t>（¥______元，大写：___________________）</w:t>
             </w:r>
           </w:p>
         </w:tc>
@@ -16944,23 +16557,8 @@
             <w:vAlign w:val="center"/>
           </w:tcPr>
           <w:p>
-            <w:pPr>
-              <w:widowControl/>
-              <w:jc w:val="left"/>
-              <w:rPr>
-                <w:rFonts w:ascii="仿宋" w:hAnsi="仿宋" w:eastAsia="仿宋" w:cs="宋体"/>
-                <w:kern w:val="0"/>
-                <w:szCs w:val="21"/>
-              </w:rPr>
-            </w:pPr>
-            <w:r>
-              <w:rPr>
-                <w:rFonts w:ascii="仿宋" w:hAnsi="仿宋" w:eastAsia="仿宋" w:cs="宋体"/>
-                <w:bCs/>
-                <w:kern w:val="0"/>
-                <w:szCs w:val="21"/>
-              </w:rPr>
-              <w:t>必须与应答一览表总价一致</w:t>
+            <w:r>
+              <w:t>不得超过最高限价人民币3万元，须与报价函总价一致</w:t>
             </w:r>
           </w:p>
         </w:tc>
@@ -21850,32 +21448,7 @@
         </w:rPr>
       </w:pPr>
       <w:r>
-        <w:rPr>
-          <w:rFonts w:ascii="仿宋" w:hAnsi="仿宋" w:eastAsia="仿宋" w:cs="Segoe UI"/>
-          <w:bCs/>
-          <w:color w:val="0F1115"/>
-          <w:sz w:val="24"/>
-          <w:shd w:val="clear" w:color="auto" w:fill="FFFFFF"/>
-        </w:rPr>
-        <w:t>项目名称：</w:t>
-      </w:r>
-      <w:r>
-        <w:rPr>
-          <w:rFonts w:ascii="Calibri" w:hAnsi="Calibri" w:eastAsia="仿宋" w:cs="Calibri"/>
-          <w:color w:val="0F1115"/>
-          <w:sz w:val="24"/>
-          <w:shd w:val="clear" w:color="auto" w:fill="FFFFFF"/>
-        </w:rPr>
-        <w:t> </w:t>
-      </w:r>
-      <w:r>
-        <w:rPr>
-          <w:rFonts w:ascii="仿宋" w:hAnsi="仿宋" w:eastAsia="仿宋" w:cs="Segoe UI"/>
-          <w:color w:val="0F1115"/>
-          <w:sz w:val="24"/>
-          <w:shd w:val="clear" w:color="auto" w:fill="FFFFFF"/>
-        </w:rPr>
-        <w:t>演讲比赛影像制作及配套宣传物料服务项目</w:t>
+        <w:t>项目名称： 义齿加工系统运维费服务项目</w:t>
       </w:r>
     </w:p>
     <w:p>
@@ -24725,69 +24298,7 @@
         </w:rPr>
       </w:pPr>
       <w:r>
-        <w:rPr>
-          <w:rFonts w:ascii="仿宋" w:hAnsi="仿宋" w:eastAsia="仿宋" w:cs="Segoe UI"/>
-          <w:bCs/>
-          <w:color w:val="0F1115"/>
-          <w:kern w:val="0"/>
-          <w:sz w:val="24"/>
-        </w:rPr>
-        <w:t>项目名称：</w:t>
-      </w:r>
-      <w:r>
-        <w:rPr>
-          <w:rFonts w:ascii="Calibri" w:hAnsi="Calibri" w:eastAsia="仿宋" w:cs="Calibri"/>
-          <w:color w:val="0F1115"/>
-          <w:kern w:val="0"/>
-          <w:sz w:val="24"/>
-        </w:rPr>
-        <w:t> </w:t>
-      </w:r>
-      <w:r>
-        <w:rPr>
-          <w:rFonts w:ascii="仿宋" w:hAnsi="仿宋" w:eastAsia="仿宋" w:cs="Segoe UI"/>
-          <w:color w:val="0F1115"/>
-          <w:kern w:val="0"/>
-          <w:sz w:val="24"/>
-        </w:rPr>
-        <w:t>演讲比赛影像制作及配套宣传物料服务项目</w:t>
-      </w:r>
-      <w:r>
-        <w:rPr>
-          <w:rFonts w:ascii="仿宋" w:hAnsi="仿宋" w:eastAsia="仿宋" w:cs="Segoe UI"/>
-          <w:color w:val="0F1115"/>
-          <w:kern w:val="0"/>
-          <w:sz w:val="24"/>
-        </w:rPr>
-        <w:br w:type="textWrapping"/>
-      </w:r>
-      <w:r>
-        <w:rPr>
-          <w:rFonts w:ascii="仿宋" w:hAnsi="仿宋" w:eastAsia="仿宋" w:cs="Segoe UI"/>
-          <w:bCs/>
-          <w:color w:val="0F1115"/>
-          <w:kern w:val="0"/>
-          <w:sz w:val="24"/>
-        </w:rPr>
-        <w:t>评审原则：</w:t>
-      </w:r>
-      <w:r>
-        <w:rPr>
-          <w:rFonts w:ascii="Calibri" w:hAnsi="Calibri" w:eastAsia="仿宋" w:cs="Calibri"/>
-          <w:color w:val="0F1115"/>
-          <w:kern w:val="0"/>
-          <w:sz w:val="24"/>
-        </w:rPr>
-        <w:t> </w:t>
-      </w:r>
-      <w:r>
-        <w:rPr>
-          <w:rFonts w:ascii="仿宋" w:hAnsi="仿宋" w:eastAsia="仿宋" w:cs="Segoe UI"/>
-          <w:color w:val="0F1115"/>
-          <w:kern w:val="0"/>
-          <w:sz w:val="24"/>
-        </w:rPr>
-        <w:t>任一参选人在下述1-5项审查中，有任一项结论为“不符合”，或其响应存在对项目核心需求的实质性负偏离，则其符合性审查总体结论为“不符合”，不得进入综合评分阶段。</w:t>
+        <w:t>项目名称： 义齿加工系统运维费服务项目</w:t>
       </w:r>
     </w:p>
     <w:tbl>
@@ -26006,24 +25517,7 @@
             <w:vAlign w:val="center"/>
           </w:tcPr>
           <w:p>
-            <w:pPr>
-              <w:widowControl/>
-              <w:spacing w:line="520" w:lineRule="exact"/>
-              <w:contextualSpacing/>
-              <w:jc w:val="left"/>
-              <w:rPr>
-                <w:rFonts w:ascii="仿宋" w:hAnsi="仿宋" w:eastAsia="仿宋" w:cs="宋体"/>
-                <w:kern w:val="0"/>
-                <w:szCs w:val="21"/>
-              </w:rPr>
-            </w:pPr>
-            <w:r>
-              <w:rPr>
-                <w:rFonts w:ascii="仿宋" w:hAnsi="仿宋" w:eastAsia="仿宋" w:cs="宋体"/>
-                <w:bCs/>
-                <w:kern w:val="0"/>
-                <w:szCs w:val="21"/>
-              </w:rPr>
+            <w:r>
               <w:t>关键响应</w:t>
             </w:r>
           </w:p>
@@ -26040,205 +25534,43 @@
             <w:vAlign w:val="center"/>
           </w:tcPr>
           <w:p>
-            <w:pPr>
-              <w:widowControl/>
-              <w:spacing w:line="520" w:lineRule="exact"/>
-              <w:contextualSpacing/>
-              <w:jc w:val="left"/>
-              <w:rPr>
-                <w:rFonts w:ascii="仿宋" w:hAnsi="仿宋" w:eastAsia="仿宋" w:cs="宋体"/>
-                <w:kern w:val="0"/>
-                <w:szCs w:val="21"/>
-              </w:rPr>
-            </w:pPr>
-            <w:r>
-              <w:rPr>
-                <w:rFonts w:ascii="仿宋" w:hAnsi="仿宋" w:eastAsia="仿宋" w:cs="宋体"/>
-                <w:bCs/>
-                <w:kern w:val="0"/>
-                <w:szCs w:val="21"/>
-              </w:rPr>
-              <w:t>审查标准：</w:t>
-            </w:r>
-            <w:r>
-              <w:rPr>
-                <w:rFonts w:ascii="Calibri" w:hAnsi="Calibri" w:eastAsia="仿宋" w:cs="Calibri"/>
-                <w:kern w:val="0"/>
-                <w:szCs w:val="21"/>
-              </w:rPr>
-              <w:t> </w:t>
-            </w:r>
-            <w:r>
-              <w:rPr>
-                <w:rFonts w:ascii="仿宋" w:hAnsi="仿宋" w:eastAsia="仿宋" w:cs="宋体"/>
-                <w:kern w:val="0"/>
-                <w:szCs w:val="21"/>
-              </w:rPr>
-              <w:t>服务方案、人员配置等核心内容是否实质性响应项目需求，无负偏离。</w:t>
-            </w:r>
-            <w:r>
-              <w:rPr>
-                <w:rFonts w:ascii="仿宋" w:hAnsi="仿宋" w:eastAsia="仿宋" w:cs="宋体"/>
-                <w:kern w:val="0"/>
-                <w:szCs w:val="21"/>
-              </w:rPr>
-              <w:br w:type="textWrapping"/>
-            </w:r>
-            <w:r>
-              <w:rPr>
-                <w:rFonts w:ascii="仿宋" w:hAnsi="仿宋" w:eastAsia="仿宋" w:cs="宋体"/>
-                <w:bCs/>
-                <w:kern w:val="0"/>
-                <w:szCs w:val="21"/>
-              </w:rPr>
+            <w:r>
+              <w:t>审查标准： 服务方案、人员配置等核心内容是否实质性响应项目需求，无负偏离。</w:t>
+            </w:r>
+          </w:p>
+          <w:p>
+            <w:r>
               <w:t>审查要点：</w:t>
             </w:r>
-            <w:r>
-              <w:rPr>
-                <w:rFonts w:ascii="仿宋" w:hAnsi="仿宋" w:eastAsia="仿宋" w:cs="宋体"/>
-                <w:kern w:val="0"/>
-                <w:szCs w:val="21"/>
-              </w:rPr>
-              <w:br w:type="textWrapping"/>
-            </w:r>
-            <w:r>
-              <w:rPr>
-                <w:rFonts w:ascii="仿宋" w:hAnsi="仿宋" w:eastAsia="仿宋" w:cs="宋体"/>
-                <w:kern w:val="0"/>
-                <w:szCs w:val="21"/>
-              </w:rPr>
-              <w:t>1.</w:t>
-            </w:r>
-            <w:r>
-              <w:rPr>
-                <w:rFonts w:ascii="Calibri" w:hAnsi="Calibri" w:eastAsia="仿宋" w:cs="Calibri"/>
-                <w:kern w:val="0"/>
-                <w:szCs w:val="21"/>
-              </w:rPr>
-              <w:t> </w:t>
-            </w:r>
-            <w:r>
-              <w:rPr>
-                <w:rFonts w:ascii="仿宋" w:hAnsi="仿宋" w:eastAsia="仿宋" w:cs="宋体"/>
-                <w:bCs/>
-                <w:kern w:val="0"/>
-                <w:szCs w:val="21"/>
-              </w:rPr>
-              <w:t>服务方案：</w:t>
-            </w:r>
-            <w:r>
-              <w:rPr>
-                <w:rFonts w:ascii="Calibri" w:hAnsi="Calibri" w:eastAsia="仿宋" w:cs="Calibri"/>
-                <w:kern w:val="0"/>
-                <w:szCs w:val="21"/>
-              </w:rPr>
-              <w:t> </w:t>
-            </w:r>
-            <w:r>
-              <w:rPr>
-                <w:rFonts w:ascii="仿宋" w:hAnsi="仿宋" w:eastAsia="仿宋" w:cs="宋体"/>
-                <w:kern w:val="0"/>
-                <w:szCs w:val="21"/>
-              </w:rPr>
-              <w:t>是否涵盖两场比赛拍摄、15位演讲人视频制作、宣传物料设计等全部核心内容；方案是否具体、可行。</w:t>
-            </w:r>
-            <w:r>
-              <w:rPr>
-                <w:rFonts w:ascii="仿宋" w:hAnsi="仿宋" w:eastAsia="仿宋" w:cs="宋体"/>
-                <w:kern w:val="0"/>
-                <w:szCs w:val="21"/>
-              </w:rPr>
-              <w:br w:type="textWrapping"/>
-            </w:r>
-            <w:r>
-              <w:rPr>
-                <w:rFonts w:ascii="仿宋" w:hAnsi="仿宋" w:eastAsia="仿宋" w:cs="宋体"/>
-                <w:kern w:val="0"/>
-                <w:szCs w:val="21"/>
-              </w:rPr>
-              <w:t>2.</w:t>
-            </w:r>
-            <w:r>
-              <w:rPr>
-                <w:rFonts w:ascii="Calibri" w:hAnsi="Calibri" w:eastAsia="仿宋" w:cs="Calibri"/>
-                <w:kern w:val="0"/>
-                <w:szCs w:val="21"/>
-              </w:rPr>
-              <w:t> </w:t>
-            </w:r>
-            <w:r>
-              <w:rPr>
-                <w:rFonts w:ascii="仿宋" w:hAnsi="仿宋" w:eastAsia="仿宋" w:cs="宋体"/>
-                <w:bCs/>
-                <w:kern w:val="0"/>
-                <w:szCs w:val="21"/>
-              </w:rPr>
-              <w:t>人员配置：</w:t>
-            </w:r>
-            <w:r>
-              <w:rPr>
-                <w:rFonts w:ascii="Calibri" w:hAnsi="Calibri" w:eastAsia="仿宋" w:cs="Calibri"/>
-                <w:kern w:val="0"/>
-                <w:szCs w:val="21"/>
-              </w:rPr>
-              <w:t> </w:t>
-            </w:r>
-            <w:r>
-              <w:rPr>
-                <w:rFonts w:ascii="仿宋" w:hAnsi="仿宋" w:eastAsia="仿宋" w:cs="宋体"/>
-                <w:kern w:val="0"/>
-                <w:szCs w:val="21"/>
-              </w:rPr>
-              <w:t>是否明确配备了项目负责人、摄影摄像、后期剪辑、平面设计等人员，并提供了相关人员信息。</w:t>
-            </w:r>
-            <w:r>
-              <w:rPr>
-                <w:rFonts w:ascii="仿宋" w:hAnsi="仿宋" w:eastAsia="仿宋" w:cs="宋体"/>
-                <w:kern w:val="0"/>
-                <w:szCs w:val="21"/>
-              </w:rPr>
-              <w:br w:type="textWrapping"/>
-            </w:r>
-            <w:r>
-              <w:rPr>
-                <w:rFonts w:ascii="仿宋" w:hAnsi="仿宋" w:eastAsia="仿宋" w:cs="宋体"/>
-                <w:kern w:val="0"/>
-                <w:szCs w:val="21"/>
-              </w:rPr>
-              <w:t>3.</w:t>
-            </w:r>
-            <w:r>
-              <w:rPr>
-                <w:rFonts w:ascii="Calibri" w:hAnsi="Calibri" w:eastAsia="仿宋" w:cs="Calibri"/>
-                <w:kern w:val="0"/>
-                <w:szCs w:val="21"/>
-              </w:rPr>
-              <w:t> </w:t>
-            </w:r>
-            <w:r>
-              <w:rPr>
-                <w:rFonts w:ascii="仿宋" w:hAnsi="仿宋" w:eastAsia="仿宋" w:cs="宋体"/>
-                <w:bCs/>
-                <w:kern w:val="0"/>
-                <w:szCs w:val="21"/>
-              </w:rPr>
-              <w:t>实质性负偏离：</w:t>
-            </w:r>
-            <w:r>
-              <w:rPr>
-                <w:rFonts w:ascii="Calibri" w:hAnsi="Calibri" w:eastAsia="仿宋" w:cs="Calibri"/>
-                <w:kern w:val="0"/>
-                <w:szCs w:val="21"/>
-              </w:rPr>
-              <w:t> </w:t>
-            </w:r>
-            <w:r>
-              <w:rPr>
-                <w:rFonts w:ascii="仿宋" w:hAnsi="仿宋" w:eastAsia="仿宋" w:cs="宋体"/>
-                <w:kern w:val="0"/>
-                <w:szCs w:val="21"/>
-              </w:rPr>
-              <w:t>是否对项目核心需求（如服务内容、质量要求、交付成果、服务期限等）存在删减、否定或无法满足的响应。</w:t>
+          </w:p>
+          <w:p>
+            <w:r>
+              <w:t>1. 服务内容： 是否涵盖义齿加工系统的软件开发、维护服务、功能应用及功能接口；是否覆盖数据库运维（定期监控、性能调优、存储空间管理、独立非数据库增量备份与回滚、多院区差异加密备份与全量还原）、数据集成引擎及数据中心数据维护、数据审计与纠错、应用运维管理（义齿加工系统各功能模块监控、医院培训指导、医院管理、应用BUG修复）及系统使用培训等全部核心内容。</w:t>
+            </w:r>
+          </w:p>
+          <w:p>
+            <w:r>
+              <w:t>2. 服务要求及知识产权： 是否承诺7*24*365小时系统原厂服务，提供年度系统运行质量报告；是否承诺按医院要求提供软件维保记录并整理成文档移交；是否承诺工程师遵守医院规章制度、签订信息安全保密协议；是否承诺系统中资料、数据等知识产权归医院所有，未经医院允许不得复制、传播、转让、许可或提供他人使用。</w:t>
+            </w:r>
+          </w:p>
+          <w:p>
+            <w:r>
+              <w:t>3. 服务质量： 是否完整提供电话支持、远程维护、现场支持的服务流程与响应机制；远程维护中对数据的查看/修改权限与用户确认机制是否明确；现场支持的故障分析、方案批准、实施及书面报告流程是否齐备。</w:t>
+            </w:r>
+          </w:p>
+          <w:p>
+            <w:r>
+              <w:t>4. 服务保障措施： 是否承诺7*24小时技术支持（含节假日），系统故障1小时内电话响应，必要时4小时赶到现场排除故障；是否指定专人负责与医院的对接与签字确认，需求变动以文档或邮件形式沟通，阶段性维护工作以任务单签字确认。</w:t>
+            </w:r>
+          </w:p>
+          <w:p>
+            <w:r>
+              <w:t>5. 人员配置： 是否明确配备本项目运维团队（含项目负责人及相应运维工程师等岗位），并提供团队成员信息及社保缴纳证明，确保社保缴纳情况与岗位配比相符。</w:t>
+            </w:r>
+          </w:p>
+          <w:p>
+            <w:r>
+              <w:t>6. 实质性负偏离： 是否对项目核心需求（服务内容、服务要求、服务质量、服务保障措施、服务期限等）存在删减、降低或改变。</w:t>
             </w:r>
           </w:p>
         </w:tc>
@@ -26254,56 +25586,13 @@
             <w:vAlign w:val="center"/>
           </w:tcPr>
           <w:p>
-            <w:pPr>
-              <w:widowControl/>
-              <w:spacing w:line="520" w:lineRule="exact"/>
-              <w:contextualSpacing/>
-              <w:jc w:val="left"/>
-              <w:rPr>
-                <w:rFonts w:ascii="仿宋" w:hAnsi="仿宋" w:eastAsia="仿宋" w:cs="宋体"/>
-                <w:kern w:val="0"/>
-                <w:szCs w:val="21"/>
-              </w:rPr>
-            </w:pPr>
-            <w:r>
-              <w:rPr>
-                <w:rFonts w:ascii="Segoe UI Symbol" w:hAnsi="Segoe UI Symbol" w:eastAsia="仿宋" w:cs="Segoe UI Symbol"/>
-                <w:kern w:val="0"/>
-                <w:szCs w:val="21"/>
-              </w:rPr>
-              <w:t>☐</w:t>
-            </w:r>
-            <w:r>
-              <w:rPr>
-                <w:rFonts w:ascii="仿宋" w:hAnsi="仿宋" w:eastAsia="仿宋" w:cs="宋体"/>
-                <w:kern w:val="0"/>
-                <w:szCs w:val="21"/>
-              </w:rPr>
-              <w:t xml:space="preserve"> 符合</w:t>
-            </w:r>
-            <w:r>
-              <w:rPr>
-                <w:rFonts w:ascii="仿宋" w:hAnsi="仿宋" w:eastAsia="仿宋" w:cs="宋体"/>
-                <w:kern w:val="0"/>
-                <w:szCs w:val="21"/>
-              </w:rPr>
-              <w:br w:type="textWrapping"/>
-            </w:r>
-            <w:r>
-              <w:rPr>
-                <w:rFonts w:ascii="Segoe UI Symbol" w:hAnsi="Segoe UI Symbol" w:eastAsia="仿宋" w:cs="Segoe UI Symbol"/>
-                <w:kern w:val="0"/>
-                <w:szCs w:val="21"/>
-              </w:rPr>
-              <w:t>☐</w:t>
-            </w:r>
-            <w:r>
-              <w:rPr>
-                <w:rFonts w:ascii="仿宋" w:hAnsi="仿宋" w:eastAsia="仿宋" w:cs="宋体"/>
-                <w:kern w:val="0"/>
-                <w:szCs w:val="21"/>
-              </w:rPr>
-              <w:t xml:space="preserve"> 不符合</w:t>
+            <w:r>
+              <w:t>☐ 符合</w:t>
+            </w:r>
+          </w:p>
+          <w:p>
+            <w:r>
+              <w:t>☐ 不符合</w:t>
             </w:r>
           </w:p>
         </w:tc>
@@ -26319,23 +25608,7 @@
             <w:vAlign w:val="center"/>
           </w:tcPr>
           <w:p>
-            <w:pPr>
-              <w:widowControl/>
-              <w:spacing w:line="520" w:lineRule="exact"/>
-              <w:contextualSpacing/>
-              <w:jc w:val="left"/>
-              <w:rPr>
-                <w:rFonts w:ascii="仿宋" w:hAnsi="仿宋" w:eastAsia="仿宋" w:cs="宋体"/>
-                <w:kern w:val="0"/>
-                <w:szCs w:val="21"/>
-              </w:rPr>
-            </w:pPr>
-            <w:r>
-              <w:rPr>
-                <w:rFonts w:ascii="仿宋" w:hAnsi="仿宋" w:eastAsia="仿宋" w:cs="宋体"/>
-                <w:kern w:val="0"/>
-                <w:szCs w:val="21"/>
-              </w:rPr>
+            <w:r>
               <w:t>此为主观判断项。评审需结合项目需求综合判断。对非核心内容的微小偏离或优化建议，不视为负偏离。</w:t>
             </w:r>
           </w:p>
@@ -27805,34 +27078,7 @@
         </w:rPr>
       </w:pPr>
       <w:r>
-        <w:rPr>
-          <w:rFonts w:ascii="仿宋" w:hAnsi="仿宋" w:eastAsia="仿宋"/>
-          <w:color w:val="0F1115"/>
-          <w:sz w:val="32"/>
-          <w:szCs w:val="32"/>
-          <w:shd w:val="clear" w:color="auto" w:fill="FFFFFF"/>
-        </w:rPr>
-        <w:t>项目名称：</w:t>
-      </w:r>
-      <w:r>
-        <w:rPr>
-          <w:rFonts w:ascii="Calibri" w:hAnsi="Calibri" w:eastAsia="仿宋" w:cs="Calibri"/>
-          <w:color w:val="0F1115"/>
-          <w:sz w:val="32"/>
-          <w:szCs w:val="32"/>
-          <w:shd w:val="clear" w:color="auto" w:fill="FFFFFF"/>
-        </w:rPr>
-        <w:t> </w:t>
-      </w:r>
-      <w:r>
-        <w:rPr>
-          <w:rFonts w:ascii="仿宋" w:hAnsi="仿宋" w:eastAsia="仿宋"/>
-          <w:color w:val="0F1115"/>
-          <w:sz w:val="32"/>
-          <w:szCs w:val="32"/>
-          <w:shd w:val="clear" w:color="auto" w:fill="FFFFFF"/>
-        </w:rPr>
-        <w:t>演讲比赛影像制作及配套宣传物料服务项目</w:t>
+        <w:t>项目名称： 义齿加工系统运维费服务项目</w:t>
       </w:r>
     </w:p>
     <w:tbl>
@@ -28088,44 +27334,13 @@
             <w:vAlign w:val="center"/>
           </w:tcPr>
           <w:p>
-            <w:pPr>
-              <w:widowControl/>
-              <w:spacing w:line="520" w:lineRule="exact"/>
-              <w:contextualSpacing/>
-              <w:jc w:val="center"/>
-              <w:rPr>
-                <w:rFonts w:ascii="仿宋" w:hAnsi="仿宋" w:eastAsia="仿宋" w:cs="宋体"/>
-                <w:kern w:val="0"/>
-                <w:szCs w:val="21"/>
-              </w:rPr>
-            </w:pPr>
-            <w:r>
-              <w:rPr>
-                <w:rFonts w:ascii="仿宋" w:hAnsi="仿宋" w:eastAsia="仿宋" w:cs="宋体"/>
-                <w:bCs/>
-                <w:kern w:val="0"/>
-                <w:szCs w:val="21"/>
-              </w:rPr>
-              <w:t>价格部分 (</w:t>
-            </w:r>
-            <w:r>
-              <w:rPr>
-                <w:rFonts w:ascii="仿宋" w:hAnsi="仿宋" w:eastAsia="仿宋" w:cs="宋体"/>
-                <w:b/>
-                <w:bCs/>
-                <w:kern w:val="0"/>
-                <w:szCs w:val="21"/>
-              </w:rPr>
-              <w:t>10</w:t>
-            </w:r>
-            <w:r>
-              <w:rPr>
-                <w:rFonts w:ascii="仿宋" w:hAnsi="仿宋" w:eastAsia="仿宋" w:cs="宋体"/>
-                <w:bCs/>
-                <w:kern w:val="0"/>
-                <w:szCs w:val="21"/>
-              </w:rPr>
-              <w:t>分)</w:t>
+            <w:r>
+              <w:t>价格部分</w:t>
+            </w:r>
+          </w:p>
+          <w:p>
+            <w:r>
+              <w:t>（10分）</w:t>
             </w:r>
           </w:p>
         </w:tc>
@@ -28141,24 +27356,7 @@
             <w:vAlign w:val="center"/>
           </w:tcPr>
           <w:p>
-            <w:pPr>
-              <w:widowControl/>
-              <w:spacing w:line="520" w:lineRule="exact"/>
-              <w:contextualSpacing/>
-              <w:jc w:val="center"/>
-              <w:rPr>
-                <w:rFonts w:ascii="仿宋" w:hAnsi="仿宋" w:eastAsia="仿宋" w:cs="宋体"/>
-                <w:kern w:val="0"/>
-                <w:szCs w:val="21"/>
-              </w:rPr>
-            </w:pPr>
-            <w:r>
-              <w:rPr>
-                <w:rFonts w:ascii="仿宋" w:hAnsi="仿宋" w:eastAsia="仿宋" w:cs="宋体"/>
-                <w:bCs/>
-                <w:kern w:val="0"/>
-                <w:szCs w:val="21"/>
-              </w:rPr>
+            <w:r>
               <w:t>参选报价</w:t>
             </w:r>
           </w:p>
@@ -28175,109 +27373,18 @@
             <w:vAlign w:val="center"/>
           </w:tcPr>
           <w:p>
-            <w:pPr>
-              <w:widowControl/>
-              <w:spacing w:line="520" w:lineRule="exact"/>
-              <w:contextualSpacing/>
-              <w:jc w:val="left"/>
-              <w:rPr>
-                <w:rFonts w:ascii="仿宋" w:hAnsi="仿宋" w:eastAsia="仿宋" w:cs="宋体"/>
-                <w:kern w:val="0"/>
-                <w:szCs w:val="21"/>
-              </w:rPr>
-            </w:pPr>
-            <w:r>
-              <w:rPr>
-                <w:rFonts w:ascii="仿宋" w:hAnsi="仿宋" w:eastAsia="仿宋" w:cs="宋体"/>
-                <w:kern w:val="0"/>
-                <w:szCs w:val="21"/>
-              </w:rPr>
-              <w:t>满足比选文件要求且参选价格最低的报价为评审基准价，其价格分为满分</w:t>
-            </w:r>
-            <w:r>
-              <w:rPr>
-                <w:rFonts w:ascii="仿宋" w:hAnsi="仿宋" w:eastAsia="仿宋" w:cs="宋体"/>
-                <w:b/>
-                <w:bCs/>
-                <w:kern w:val="0"/>
-                <w:szCs w:val="21"/>
-              </w:rPr>
-              <w:t>10</w:t>
-            </w:r>
-            <w:r>
-              <w:rPr>
-                <w:rFonts w:ascii="仿宋" w:hAnsi="仿宋" w:eastAsia="仿宋" w:cs="宋体"/>
-                <w:kern w:val="0"/>
-                <w:szCs w:val="21"/>
-              </w:rPr>
-              <w:t>分。</w:t>
-            </w:r>
-            <w:r>
-              <w:rPr>
-                <w:rFonts w:ascii="仿宋" w:hAnsi="仿宋" w:eastAsia="仿宋" w:cs="宋体"/>
-                <w:kern w:val="0"/>
-                <w:szCs w:val="21"/>
-              </w:rPr>
-              <w:br w:type="textWrapping"/>
-            </w:r>
-            <w:r>
-              <w:rPr>
-                <w:rFonts w:ascii="仿宋" w:hAnsi="仿宋" w:eastAsia="仿宋" w:cs="宋体"/>
-                <w:kern w:val="0"/>
-                <w:szCs w:val="21"/>
-              </w:rPr>
-              <w:t>其他参选人的价</w:t>
-            </w:r>
-            <w:r>
-              <w:rPr>
-                <w:rFonts w:hint="eastAsia" w:ascii="仿宋" w:hAnsi="仿宋" w:eastAsia="仿宋" w:cs="宋体"/>
-                <w:kern w:val="0"/>
-                <w:szCs w:val="21"/>
-              </w:rPr>
-              <w:t xml:space="preserve"> </w:t>
-            </w:r>
-            <w:r>
-              <w:rPr>
-                <w:rFonts w:ascii="仿宋" w:hAnsi="仿宋" w:eastAsia="仿宋" w:cs="宋体"/>
-                <w:kern w:val="0"/>
-                <w:szCs w:val="21"/>
-              </w:rPr>
-              <w:t>格分统一按照下列公式计算：</w:t>
-            </w:r>
-            <w:r>
-              <w:rPr>
-                <w:rFonts w:ascii="仿宋" w:hAnsi="仿宋" w:eastAsia="仿宋" w:cs="宋体"/>
-                <w:kern w:val="0"/>
-                <w:szCs w:val="21"/>
-              </w:rPr>
-              <w:br w:type="textWrapping"/>
-            </w:r>
-            <w:r>
-              <w:rPr>
-                <w:rFonts w:ascii="仿宋" w:hAnsi="仿宋" w:eastAsia="仿宋" w:cs="宋体"/>
-                <w:bCs/>
-                <w:kern w:val="0"/>
-                <w:szCs w:val="21"/>
-              </w:rPr>
-              <w:t>价格得分 = (评审基准价 / 参选报价) ×</w:t>
-            </w:r>
-            <w:r>
-              <w:rPr>
-                <w:rFonts w:ascii="仿宋" w:hAnsi="仿宋" w:eastAsia="仿宋" w:cs="宋体"/>
-                <w:b/>
-                <w:bCs/>
-                <w:kern w:val="0"/>
-                <w:szCs w:val="21"/>
-              </w:rPr>
-              <w:t>10</w:t>
-            </w:r>
-            <w:r>
-              <w:rPr>
-                <w:rFonts w:ascii="仿宋" w:hAnsi="仿宋" w:eastAsia="仿宋" w:cs="宋体"/>
-                <w:kern w:val="0"/>
-                <w:szCs w:val="21"/>
-              </w:rPr>
-              <w:t>。</w:t>
+            <w:r>
+              <w:t>满足比选文件要求且参选价格最低的报价为评审基准价，其价格分为满分10分。</w:t>
+            </w:r>
+          </w:p>
+          <w:p>
+            <w:r>
+              <w:t>其他参选人的价格分统一按照下列公式计算：</w:t>
+            </w:r>
+          </w:p>
+          <w:p>
+            <w:r>
+              <w:t>价格得分 =（评审基准价 / 参选报价）× 10。</w:t>
             </w:r>
           </w:p>
         </w:tc>
@@ -28293,25 +27400,7 @@
             <w:vAlign w:val="center"/>
           </w:tcPr>
           <w:p>
-            <w:pPr>
-              <w:widowControl/>
-              <w:spacing w:line="520" w:lineRule="exact"/>
-              <w:contextualSpacing/>
-              <w:jc w:val="center"/>
-              <w:rPr>
-                <w:rFonts w:ascii="仿宋" w:hAnsi="仿宋" w:eastAsia="仿宋" w:cs="宋体"/>
-                <w:kern w:val="0"/>
-                <w:szCs w:val="21"/>
-              </w:rPr>
-            </w:pPr>
-            <w:r>
-              <w:rPr>
-                <w:rFonts w:ascii="仿宋" w:hAnsi="仿宋" w:eastAsia="仿宋" w:cs="宋体"/>
-                <w:b/>
-                <w:bCs/>
-                <w:kern w:val="0"/>
-                <w:szCs w:val="21"/>
-              </w:rPr>
+            <w:r>
               <w:t>10</w:t>
             </w:r>
           </w:p>
@@ -28328,23 +27417,7 @@
             <w:vAlign w:val="center"/>
           </w:tcPr>
           <w:p>
-            <w:pPr>
-              <w:widowControl/>
-              <w:spacing w:line="520" w:lineRule="exact"/>
-              <w:contextualSpacing/>
-              <w:jc w:val="center"/>
-              <w:rPr>
-                <w:rFonts w:ascii="仿宋" w:hAnsi="仿宋" w:eastAsia="仿宋" w:cs="宋体"/>
-                <w:kern w:val="0"/>
-                <w:szCs w:val="21"/>
-              </w:rPr>
-            </w:pPr>
-            <w:r>
-              <w:rPr>
-                <w:rFonts w:ascii="仿宋" w:hAnsi="仿宋" w:eastAsia="仿宋" w:cs="宋体"/>
-                <w:kern w:val="0"/>
-                <w:szCs w:val="21"/>
-              </w:rPr>
+            <w:r>
               <w:t>客观</w:t>
             </w:r>
           </w:p>
@@ -28379,44 +27452,13 @@
             <w:vAlign w:val="center"/>
           </w:tcPr>
           <w:p>
-            <w:pPr>
-              <w:widowControl/>
-              <w:spacing w:line="520" w:lineRule="exact"/>
-              <w:contextualSpacing/>
-              <w:jc w:val="center"/>
-              <w:rPr>
-                <w:rFonts w:ascii="仿宋" w:hAnsi="仿宋" w:eastAsia="仿宋" w:cs="宋体"/>
-                <w:kern w:val="0"/>
-                <w:szCs w:val="21"/>
-              </w:rPr>
-            </w:pPr>
-            <w:r>
-              <w:rPr>
-                <w:rFonts w:ascii="仿宋" w:hAnsi="仿宋" w:eastAsia="仿宋" w:cs="宋体"/>
-                <w:bCs/>
-                <w:kern w:val="0"/>
-                <w:szCs w:val="21"/>
-              </w:rPr>
-              <w:t>商务部分 (</w:t>
-            </w:r>
-            <w:r>
-              <w:rPr>
-                <w:rFonts w:ascii="仿宋" w:hAnsi="仿宋" w:eastAsia="仿宋" w:cs="宋体"/>
-                <w:b/>
-                <w:bCs/>
-                <w:kern w:val="0"/>
-                <w:szCs w:val="21"/>
-              </w:rPr>
-              <w:t>35</w:t>
-            </w:r>
-            <w:r>
-              <w:rPr>
-                <w:rFonts w:ascii="仿宋" w:hAnsi="仿宋" w:eastAsia="仿宋" w:cs="宋体"/>
-                <w:bCs/>
-                <w:kern w:val="0"/>
-                <w:szCs w:val="21"/>
-              </w:rPr>
-              <w:t>分)</w:t>
+            <w:r>
+              <w:t>商务部分</w:t>
+            </w:r>
+          </w:p>
+          <w:p>
+            <w:r>
+              <w:t>（35分）</w:t>
             </w:r>
           </w:p>
         </w:tc>
@@ -28432,25 +27474,8 @@
             <w:vAlign w:val="center"/>
           </w:tcPr>
           <w:p>
-            <w:pPr>
-              <w:widowControl/>
-              <w:spacing w:line="520" w:lineRule="exact"/>
-              <w:contextualSpacing/>
-              <w:jc w:val="center"/>
-              <w:rPr>
-                <w:rFonts w:ascii="仿宋" w:hAnsi="仿宋" w:eastAsia="仿宋" w:cs="宋体"/>
-                <w:kern w:val="0"/>
-                <w:szCs w:val="21"/>
-              </w:rPr>
-            </w:pPr>
-            <w:r>
-              <w:rPr>
-                <w:rFonts w:ascii="仿宋" w:hAnsi="仿宋" w:eastAsia="仿宋" w:cs="宋体"/>
-                <w:bCs/>
-                <w:kern w:val="0"/>
-                <w:szCs w:val="21"/>
-              </w:rPr>
-              <w:t>项目团队配置</w:t>
+            <w:r>
+              <w:t>运维项目团队配置</w:t>
             </w:r>
           </w:p>
         </w:tc>
@@ -28466,459 +27491,23 @@
             <w:vAlign w:val="center"/>
           </w:tcPr>
           <w:p>
-            <w:pPr>
-              <w:widowControl/>
-              <w:spacing w:line="520" w:lineRule="exact"/>
-              <w:contextualSpacing/>
-              <w:jc w:val="left"/>
-              <w:rPr>
-                <w:rFonts w:ascii="仿宋" w:hAnsi="仿宋" w:eastAsia="仿宋" w:cs="宋体"/>
-                <w:kern w:val="0"/>
-                <w:szCs w:val="21"/>
-              </w:rPr>
-            </w:pPr>
-            <w:r>
-              <w:rPr>
-                <w:rFonts w:ascii="仿宋" w:hAnsi="仿宋" w:eastAsia="仿宋" w:cs="宋体"/>
-                <w:bCs/>
-                <w:kern w:val="0"/>
-                <w:szCs w:val="21"/>
-              </w:rPr>
-              <w:t>1. 基本配置（</w:t>
-            </w:r>
-            <w:r>
-              <w:rPr>
-                <w:rFonts w:ascii="仿宋" w:hAnsi="仿宋" w:eastAsia="仿宋" w:cs="宋体"/>
-                <w:b/>
-                <w:bCs/>
-                <w:kern w:val="0"/>
-                <w:szCs w:val="21"/>
-              </w:rPr>
-              <w:t>4</w:t>
-            </w:r>
-            <w:r>
-              <w:rPr>
-                <w:rFonts w:ascii="仿宋" w:hAnsi="仿宋" w:eastAsia="仿宋" w:cs="宋体"/>
-                <w:bCs/>
-                <w:kern w:val="0"/>
-                <w:szCs w:val="21"/>
-              </w:rPr>
-              <w:t>分，客观分）：</w:t>
-            </w:r>
-            <w:r>
-              <w:rPr>
-                <w:rFonts w:ascii="Calibri" w:hAnsi="Calibri" w:eastAsia="仿宋" w:cs="Calibri"/>
-                <w:kern w:val="0"/>
-                <w:szCs w:val="21"/>
-              </w:rPr>
-              <w:t> </w:t>
-            </w:r>
-            <w:r>
-              <w:rPr>
-                <w:rFonts w:ascii="仿宋" w:hAnsi="仿宋" w:eastAsia="仿宋" w:cs="宋体"/>
-                <w:kern w:val="0"/>
-                <w:szCs w:val="21"/>
-              </w:rPr>
-              <w:t>提供为本项目配备的项目负责人、摄像师、剪辑师、设计师的名单及简历。四类核心人员配置齐全得</w:t>
-            </w:r>
-            <w:r>
-              <w:rPr>
-                <w:rFonts w:ascii="仿宋" w:hAnsi="仿宋" w:eastAsia="仿宋" w:cs="宋体"/>
-                <w:b/>
-                <w:bCs/>
-                <w:kern w:val="0"/>
-                <w:szCs w:val="21"/>
-              </w:rPr>
-              <w:t>4</w:t>
-            </w:r>
-            <w:r>
-              <w:rPr>
-                <w:rFonts w:ascii="仿宋" w:hAnsi="仿宋" w:eastAsia="仿宋" w:cs="宋体"/>
-                <w:kern w:val="0"/>
-                <w:szCs w:val="21"/>
-              </w:rPr>
-              <w:t>分；每缺少一类扣</w:t>
-            </w:r>
-            <w:r>
-              <w:rPr>
-                <w:rFonts w:ascii="仿宋" w:hAnsi="仿宋" w:eastAsia="仿宋" w:cs="宋体"/>
-                <w:b/>
-                <w:bCs/>
-                <w:kern w:val="0"/>
-                <w:szCs w:val="21"/>
-              </w:rPr>
-              <w:t>1</w:t>
-            </w:r>
-            <w:r>
-              <w:rPr>
-                <w:rFonts w:ascii="仿宋" w:hAnsi="仿宋" w:eastAsia="仿宋" w:cs="宋体"/>
-                <w:kern w:val="0"/>
-                <w:szCs w:val="21"/>
-              </w:rPr>
-              <w:t>分，扣完为止。</w:t>
-            </w:r>
-            <w:r>
-              <w:rPr>
-                <w:rFonts w:ascii="仿宋" w:hAnsi="仿宋" w:eastAsia="仿宋" w:cs="宋体"/>
-                <w:kern w:val="0"/>
-                <w:szCs w:val="21"/>
-              </w:rPr>
-              <w:br w:type="textWrapping"/>
-            </w:r>
-            <w:r>
-              <w:rPr>
-                <w:rFonts w:ascii="仿宋" w:hAnsi="仿宋" w:eastAsia="仿宋" w:cs="宋体"/>
-                <w:bCs/>
-                <w:kern w:val="0"/>
-                <w:szCs w:val="21"/>
-              </w:rPr>
-              <w:t>2. 团队资历（</w:t>
-            </w:r>
-            <w:r>
-              <w:rPr>
-                <w:rFonts w:hint="eastAsia" w:ascii="仿宋" w:hAnsi="仿宋" w:eastAsia="仿宋" w:cs="宋体"/>
-                <w:b/>
-                <w:bCs/>
-                <w:kern w:val="0"/>
-                <w:szCs w:val="21"/>
-              </w:rPr>
-              <w:t>16</w:t>
-            </w:r>
-            <w:r>
-              <w:rPr>
-                <w:rFonts w:ascii="仿宋" w:hAnsi="仿宋" w:eastAsia="仿宋" w:cs="宋体"/>
-                <w:bCs/>
-                <w:kern w:val="0"/>
-                <w:szCs w:val="21"/>
-              </w:rPr>
-              <w:t>分）：</w:t>
-            </w:r>
-            <w:r>
-              <w:rPr>
-                <w:rFonts w:ascii="仿宋" w:hAnsi="仿宋" w:eastAsia="仿宋" w:cs="宋体"/>
-                <w:kern w:val="0"/>
-                <w:szCs w:val="21"/>
-              </w:rPr>
-              <w:br w:type="textWrapping"/>
-            </w:r>
-            <w:r>
-              <w:rPr>
-                <w:rFonts w:ascii="仿宋" w:hAnsi="仿宋" w:eastAsia="仿宋" w:cs="宋体"/>
-                <w:kern w:val="0"/>
-                <w:szCs w:val="21"/>
-              </w:rPr>
-              <w:t> </w:t>
-            </w:r>
-            <w:r>
-              <w:rPr>
-                <w:rFonts w:hint="eastAsia" w:ascii="微软雅黑" w:hAnsi="微软雅黑" w:eastAsia="微软雅黑" w:cs="微软雅黑"/>
-                <w:kern w:val="0"/>
-                <w:szCs w:val="21"/>
-              </w:rPr>
-              <w:t>• </w:t>
-            </w:r>
-            <w:r>
-              <w:rPr>
-                <w:rFonts w:ascii="仿宋" w:hAnsi="仿宋" w:eastAsia="仿宋" w:cs="宋体"/>
-                <w:bCs/>
-                <w:kern w:val="0"/>
-                <w:szCs w:val="21"/>
-              </w:rPr>
-              <w:t>人员稳定性（</w:t>
-            </w:r>
-            <w:r>
-              <w:rPr>
-                <w:rFonts w:ascii="仿宋" w:hAnsi="仿宋" w:eastAsia="仿宋" w:cs="宋体"/>
-                <w:b/>
-                <w:bCs/>
-                <w:kern w:val="0"/>
-                <w:szCs w:val="21"/>
-              </w:rPr>
-              <w:t>4</w:t>
-            </w:r>
-            <w:r>
-              <w:rPr>
-                <w:rFonts w:ascii="仿宋" w:hAnsi="仿宋" w:eastAsia="仿宋" w:cs="宋体"/>
-                <w:bCs/>
-                <w:kern w:val="0"/>
-                <w:szCs w:val="21"/>
-              </w:rPr>
-              <w:t>分，客观分）：</w:t>
-            </w:r>
-            <w:r>
-              <w:rPr>
-                <w:rFonts w:ascii="Calibri" w:hAnsi="Calibri" w:eastAsia="仿宋" w:cs="Calibri"/>
-                <w:kern w:val="0"/>
-                <w:szCs w:val="21"/>
-              </w:rPr>
-              <w:t> </w:t>
-            </w:r>
-            <w:r>
-              <w:rPr>
-                <w:rFonts w:ascii="仿宋" w:hAnsi="仿宋" w:eastAsia="仿宋" w:cs="宋体"/>
-                <w:kern w:val="0"/>
-                <w:szCs w:val="21"/>
-              </w:rPr>
-              <w:t>上述核心人员中，每提供一人近</w:t>
-            </w:r>
-            <w:r>
-              <w:rPr>
-                <w:rFonts w:hint="eastAsia" w:ascii="仿宋" w:hAnsi="仿宋" w:eastAsia="仿宋" w:cs="宋体"/>
-                <w:kern w:val="0"/>
-                <w:szCs w:val="21"/>
-              </w:rPr>
-              <w:t>一</w:t>
-            </w:r>
-            <w:r>
-              <w:rPr>
-                <w:rFonts w:ascii="仿宋" w:hAnsi="仿宋" w:eastAsia="仿宋" w:cs="宋体"/>
-                <w:kern w:val="0"/>
-                <w:szCs w:val="21"/>
-              </w:rPr>
-              <w:t>年由参选单位缴纳的社保证明，得</w:t>
-            </w:r>
-            <w:r>
-              <w:rPr>
-                <w:rFonts w:ascii="仿宋" w:hAnsi="仿宋" w:eastAsia="仿宋" w:cs="宋体"/>
-                <w:b/>
-                <w:bCs/>
-                <w:kern w:val="0"/>
-                <w:szCs w:val="21"/>
-              </w:rPr>
-              <w:t>1</w:t>
-            </w:r>
-            <w:r>
-              <w:rPr>
-                <w:rFonts w:ascii="仿宋" w:hAnsi="仿宋" w:eastAsia="仿宋" w:cs="宋体"/>
-                <w:kern w:val="0"/>
-                <w:szCs w:val="21"/>
-              </w:rPr>
-              <w:t>分。</w:t>
-            </w:r>
-            <w:r>
-              <w:rPr>
-                <w:rFonts w:ascii="仿宋" w:hAnsi="仿宋" w:eastAsia="仿宋" w:cs="宋体"/>
-                <w:kern w:val="0"/>
-                <w:szCs w:val="21"/>
-              </w:rPr>
-              <w:br w:type="textWrapping"/>
-            </w:r>
-            <w:r>
-              <w:rPr>
-                <w:rFonts w:ascii="仿宋" w:hAnsi="仿宋" w:eastAsia="仿宋" w:cs="宋体"/>
-                <w:kern w:val="0"/>
-                <w:szCs w:val="21"/>
-              </w:rPr>
-              <w:t> </w:t>
-            </w:r>
-            <w:r>
-              <w:rPr>
-                <w:rFonts w:hint="eastAsia" w:ascii="微软雅黑" w:hAnsi="微软雅黑" w:eastAsia="微软雅黑" w:cs="微软雅黑"/>
-                <w:kern w:val="0"/>
-                <w:szCs w:val="21"/>
-              </w:rPr>
-              <w:t>• </w:t>
-            </w:r>
-            <w:r>
-              <w:rPr>
-                <w:rFonts w:ascii="仿宋" w:hAnsi="仿宋" w:eastAsia="仿宋" w:cs="宋体"/>
-                <w:bCs/>
-                <w:kern w:val="0"/>
-                <w:szCs w:val="21"/>
-              </w:rPr>
-              <w:t>从业经验（</w:t>
-            </w:r>
-            <w:r>
-              <w:rPr>
-                <w:rFonts w:ascii="仿宋" w:hAnsi="仿宋" w:eastAsia="仿宋" w:cs="宋体"/>
-                <w:b/>
-                <w:bCs/>
-                <w:kern w:val="0"/>
-                <w:szCs w:val="21"/>
-              </w:rPr>
-              <w:t>4</w:t>
-            </w:r>
-            <w:r>
-              <w:rPr>
-                <w:rFonts w:ascii="仿宋" w:hAnsi="仿宋" w:eastAsia="仿宋" w:cs="宋体"/>
-                <w:bCs/>
-                <w:kern w:val="0"/>
-                <w:szCs w:val="21"/>
-              </w:rPr>
-              <w:t>分，客观分）：</w:t>
-            </w:r>
-            <w:r>
-              <w:rPr>
-                <w:rFonts w:ascii="Calibri" w:hAnsi="Calibri" w:eastAsia="仿宋" w:cs="Calibri"/>
-                <w:kern w:val="0"/>
-                <w:szCs w:val="21"/>
-              </w:rPr>
-              <w:t> </w:t>
-            </w:r>
-            <w:r>
-              <w:rPr>
-                <w:rFonts w:ascii="仿宋" w:hAnsi="仿宋" w:eastAsia="仿宋" w:cs="宋体"/>
-                <w:kern w:val="0"/>
-                <w:szCs w:val="21"/>
-              </w:rPr>
-              <w:t>上述核心人员中，每提供一人3年以上相关工作经验证明（如劳动合同、项目证明等），得</w:t>
-            </w:r>
-            <w:r>
-              <w:rPr>
-                <w:rFonts w:ascii="仿宋" w:hAnsi="仿宋" w:eastAsia="仿宋" w:cs="宋体"/>
-                <w:b/>
-                <w:bCs/>
-                <w:kern w:val="0"/>
-                <w:szCs w:val="21"/>
-              </w:rPr>
-              <w:t>1</w:t>
-            </w:r>
-            <w:r>
-              <w:rPr>
-                <w:rFonts w:ascii="仿宋" w:hAnsi="仿宋" w:eastAsia="仿宋" w:cs="宋体"/>
-                <w:kern w:val="0"/>
-                <w:szCs w:val="21"/>
-              </w:rPr>
-              <w:t>分。</w:t>
-            </w:r>
-            <w:r>
-              <w:rPr>
-                <w:rFonts w:ascii="仿宋" w:hAnsi="仿宋" w:eastAsia="仿宋" w:cs="宋体"/>
-                <w:kern w:val="0"/>
-                <w:szCs w:val="21"/>
-              </w:rPr>
-              <w:br w:type="textWrapping"/>
-            </w:r>
-            <w:r>
-              <w:rPr>
-                <w:rFonts w:ascii="仿宋" w:hAnsi="仿宋" w:eastAsia="仿宋" w:cs="宋体"/>
-                <w:kern w:val="0"/>
-                <w:szCs w:val="21"/>
-              </w:rPr>
-              <w:t> </w:t>
-            </w:r>
-            <w:r>
-              <w:rPr>
-                <w:rFonts w:hint="eastAsia" w:ascii="微软雅黑" w:hAnsi="微软雅黑" w:eastAsia="微软雅黑" w:cs="微软雅黑"/>
-                <w:kern w:val="0"/>
-                <w:szCs w:val="21"/>
-              </w:rPr>
-              <w:t>• </w:t>
-            </w:r>
-            <w:r>
-              <w:rPr>
-                <w:rFonts w:ascii="仿宋" w:hAnsi="仿宋" w:eastAsia="仿宋" w:cs="宋体"/>
-                <w:bCs/>
-                <w:kern w:val="0"/>
-                <w:szCs w:val="21"/>
-              </w:rPr>
-              <w:t>综合素养（</w:t>
-            </w:r>
-            <w:r>
-              <w:rPr>
-                <w:rFonts w:hint="eastAsia" w:ascii="仿宋" w:hAnsi="仿宋" w:eastAsia="仿宋" w:cs="宋体"/>
-                <w:b/>
-                <w:bCs/>
-                <w:kern w:val="0"/>
-                <w:szCs w:val="21"/>
-              </w:rPr>
-              <w:t>8</w:t>
-            </w:r>
-            <w:r>
-              <w:rPr>
-                <w:rFonts w:ascii="仿宋" w:hAnsi="仿宋" w:eastAsia="仿宋" w:cs="宋体"/>
-                <w:bCs/>
-                <w:kern w:val="0"/>
-                <w:szCs w:val="21"/>
-              </w:rPr>
-              <w:t>分，主观分）：</w:t>
-            </w:r>
-            <w:r>
-              <w:rPr>
-                <w:rFonts w:ascii="Calibri" w:hAnsi="Calibri" w:eastAsia="仿宋" w:cs="Calibri"/>
-                <w:kern w:val="0"/>
-                <w:szCs w:val="21"/>
-              </w:rPr>
-              <w:t> </w:t>
-            </w:r>
-            <w:r>
-              <w:rPr>
-                <w:rFonts w:ascii="仿宋" w:hAnsi="仿宋" w:eastAsia="仿宋" w:cs="宋体"/>
-                <w:kern w:val="0"/>
-                <w:szCs w:val="21"/>
-              </w:rPr>
-              <w:t>根据团队</w:t>
-            </w:r>
-            <w:r>
-              <w:rPr>
-                <w:rFonts w:hint="eastAsia" w:ascii="仿宋" w:hAnsi="仿宋" w:eastAsia="仿宋" w:cs="宋体"/>
-                <w:kern w:val="0"/>
-                <w:szCs w:val="21"/>
-                <w:lang w:val="en-US" w:eastAsia="zh-CN"/>
-              </w:rPr>
-              <w:t>人数与</w:t>
-            </w:r>
-            <w:r>
-              <w:rPr>
-                <w:rFonts w:ascii="仿宋" w:hAnsi="仿宋" w:eastAsia="仿宋" w:cs="宋体"/>
-                <w:kern w:val="0"/>
-                <w:szCs w:val="21"/>
-              </w:rPr>
-              <w:t>整体学历背景（影视、传媒、艺术类相关专业本科及以上）、行业权威认证及与项目的匹配度综合评定，优秀得</w:t>
-            </w:r>
-            <w:r>
-              <w:rPr>
-                <w:rFonts w:hint="eastAsia" w:ascii="仿宋" w:hAnsi="仿宋" w:eastAsia="仿宋" w:cs="宋体"/>
-                <w:b/>
-                <w:bCs/>
-                <w:kern w:val="0"/>
-                <w:szCs w:val="21"/>
-              </w:rPr>
-              <w:t>8</w:t>
-            </w:r>
-            <w:r>
-              <w:rPr>
-                <w:rFonts w:ascii="仿宋" w:hAnsi="仿宋" w:eastAsia="仿宋" w:cs="宋体"/>
-                <w:kern w:val="0"/>
-                <w:szCs w:val="21"/>
-              </w:rPr>
-              <w:t>分，良好得</w:t>
-            </w:r>
-            <w:r>
-              <w:rPr>
-                <w:rFonts w:hint="eastAsia" w:ascii="仿宋" w:hAnsi="仿宋" w:eastAsia="仿宋" w:cs="宋体"/>
-                <w:b/>
-                <w:bCs/>
-                <w:kern w:val="0"/>
-                <w:szCs w:val="21"/>
-              </w:rPr>
-              <w:t>5</w:t>
-            </w:r>
-            <w:r>
-              <w:rPr>
-                <w:rFonts w:ascii="仿宋" w:hAnsi="仿宋" w:eastAsia="仿宋" w:cs="宋体"/>
-                <w:kern w:val="0"/>
-                <w:szCs w:val="21"/>
-              </w:rPr>
-              <w:t>分，一般得</w:t>
-            </w:r>
-            <w:r>
-              <w:rPr>
-                <w:rFonts w:hint="eastAsia" w:ascii="仿宋" w:hAnsi="仿宋" w:eastAsia="仿宋" w:cs="宋体"/>
-                <w:b/>
-                <w:bCs/>
-                <w:kern w:val="0"/>
-                <w:szCs w:val="21"/>
-              </w:rPr>
-              <w:t>2</w:t>
-            </w:r>
-            <w:r>
-              <w:rPr>
-                <w:rFonts w:ascii="仿宋" w:hAnsi="仿宋" w:eastAsia="仿宋" w:cs="宋体"/>
-                <w:kern w:val="0"/>
-                <w:szCs w:val="21"/>
-              </w:rPr>
-              <w:t>分。</w:t>
+            <w:r>
+              <w:t>围绕本项目义齿加工系统运维工作，对参选人为本项目配备的运维团队从岗位配置、社保缴纳情况及社保与岗位配比等方面进行综合评定（不设置专业学历、职称、证书及厂商认证等门槛性要求）：</w:t>
+            </w:r>
+          </w:p>
+          <w:p>
+            <w:r>
+              <w:t>1. 岗位配置完整性（10分，客观分）： 参选人须提交本项目运维团队人员名单，明确项目负责人、运维工程师等岗位。岗位配置齐全得10分；每缺少一个必要岗位扣2分，扣完为止。</w:t>
+            </w:r>
+          </w:p>
+          <w:p>
+            <w:r>
+              <w:t>2. 社保缴纳情况（10分，客观分）： 上述运维团队成员中，每提供一人由参选单位缴纳的近6个月（含投标截止月前1个月起向前推算6个月）社保缴纳证明，得2分，最高10分。</w:t>
+            </w:r>
+          </w:p>
+          <w:p>
+            <w:r>
+              <w:t>3. 社保与岗位配比（10分，客观分）： 运维团队成员全部由参选单位缴纳社保且社保缴纳人员与所投岗位一一对应的，得10分；社保缴纳人员与岗位对应率每下降10%扣2分，扣完为止（对应率＝由参选单位缴纳社保的团队人员数/团队总人数×100%）。</w:t>
             </w:r>
           </w:p>
         </w:tc>
@@ -28934,36 +27523,8 @@
             <w:vAlign w:val="center"/>
           </w:tcPr>
           <w:p>
-            <w:pPr>
-              <w:widowControl/>
-              <w:spacing w:line="520" w:lineRule="exact"/>
-              <w:contextualSpacing/>
-              <w:jc w:val="center"/>
-              <w:rPr>
-                <w:rFonts w:ascii="仿宋" w:hAnsi="仿宋" w:eastAsia="仿宋" w:cs="宋体"/>
-                <w:kern w:val="0"/>
-                <w:szCs w:val="21"/>
-              </w:rPr>
-            </w:pPr>
-            <w:r>
-              <w:rPr>
-                <w:rFonts w:ascii="仿宋" w:hAnsi="仿宋" w:eastAsia="仿宋" w:cs="宋体"/>
-                <w:b/>
-                <w:bCs/>
-                <w:kern w:val="0"/>
-                <w:szCs w:val="21"/>
-              </w:rPr>
-              <w:t>2</w:t>
-            </w:r>
-            <w:r>
-              <w:rPr>
-                <w:rFonts w:hint="eastAsia" w:ascii="仿宋" w:hAnsi="仿宋" w:eastAsia="仿宋" w:cs="宋体"/>
-                <w:b/>
-                <w:bCs/>
-                <w:kern w:val="0"/>
-                <w:szCs w:val="21"/>
-              </w:rPr>
-              <w:t>0</w:t>
+            <w:r>
+              <w:t>30</w:t>
             </w:r>
           </w:p>
         </w:tc>
@@ -28979,24 +27540,8 @@
             <w:vAlign w:val="center"/>
           </w:tcPr>
           <w:p>
-            <w:pPr>
-              <w:widowControl/>
-              <w:spacing w:line="520" w:lineRule="exact"/>
-              <w:contextualSpacing/>
-              <w:jc w:val="center"/>
-              <w:rPr>
-                <w:rFonts w:ascii="仿宋" w:hAnsi="仿宋" w:eastAsia="仿宋" w:cs="宋体"/>
-                <w:kern w:val="0"/>
-                <w:szCs w:val="21"/>
-              </w:rPr>
-            </w:pPr>
-            <w:r>
-              <w:rPr>
-                <w:rFonts w:ascii="仿宋" w:hAnsi="仿宋" w:eastAsia="仿宋" w:cs="宋体"/>
-                <w:kern w:val="0"/>
-                <w:szCs w:val="21"/>
-              </w:rPr>
-              <w:t>客观/主观</w:t>
+            <w:r>
+              <w:t>客观</w:t>
             </w:r>
           </w:p>
         </w:tc>
@@ -29030,17 +27575,7 @@
             <w:vAlign w:val="center"/>
           </w:tcPr>
           <w:p>
-            <w:pPr>
-              <w:widowControl/>
-              <w:spacing w:line="520" w:lineRule="exact"/>
-              <w:contextualSpacing/>
-              <w:jc w:val="center"/>
-              <w:rPr>
-                <w:rFonts w:ascii="仿宋" w:hAnsi="仿宋" w:eastAsia="仿宋" w:cs="宋体"/>
-                <w:kern w:val="0"/>
-                <w:szCs w:val="21"/>
-              </w:rPr>
-            </w:pPr>
+            <w:r/>
           </w:p>
         </w:tc>
         <w:tc>
@@ -29055,23 +27590,7 @@
             <w:vAlign w:val="center"/>
           </w:tcPr>
           <w:p>
-            <w:pPr>
-              <w:widowControl/>
-              <w:spacing w:line="520" w:lineRule="exact"/>
-              <w:contextualSpacing/>
-              <w:jc w:val="center"/>
-              <w:rPr>
-                <w:rFonts w:ascii="仿宋" w:hAnsi="仿宋" w:eastAsia="仿宋" w:cs="宋体"/>
-                <w:bCs/>
-                <w:kern w:val="0"/>
-                <w:szCs w:val="21"/>
-              </w:rPr>
-            </w:pPr>
-            <w:r>
-              <w:rPr>
-                <w:rFonts w:hint="eastAsia" w:ascii="仿宋" w:hAnsi="仿宋" w:eastAsia="仿宋" w:cs="宋体"/>
-                <w:szCs w:val="21"/>
-              </w:rPr>
+            <w:r>
               <w:t>内容完整性和编制水平</w:t>
             </w:r>
           </w:p>
@@ -29088,151 +27607,23 @@
             <w:vAlign w:val="center"/>
           </w:tcPr>
           <w:p>
-            <w:pPr>
-              <w:widowControl/>
-              <w:spacing w:line="360" w:lineRule="auto"/>
-              <w:rPr>
-                <w:rFonts w:ascii="仿宋" w:hAnsi="仿宋" w:eastAsia="仿宋" w:cs="宋体"/>
-                <w:szCs w:val="21"/>
-              </w:rPr>
-            </w:pPr>
-            <w:r>
-              <w:rPr>
-                <w:rFonts w:ascii="仿宋" w:hAnsi="仿宋" w:eastAsia="仿宋" w:cs="宋体"/>
-                <w:bCs/>
-                <w:kern w:val="0"/>
-                <w:szCs w:val="21"/>
-              </w:rPr>
-              <w:t>优秀（</w:t>
-            </w:r>
-            <w:r>
-              <w:rPr>
-                <w:rFonts w:hint="eastAsia" w:ascii="仿宋" w:hAnsi="仿宋" w:eastAsia="仿宋" w:cs="宋体"/>
-                <w:bCs/>
-                <w:kern w:val="0"/>
-                <w:szCs w:val="21"/>
-              </w:rPr>
-              <w:t>5</w:t>
-            </w:r>
-            <w:r>
-              <w:rPr>
-                <w:rFonts w:ascii="仿宋" w:hAnsi="仿宋" w:eastAsia="仿宋" w:cs="宋体"/>
-                <w:bCs/>
-                <w:kern w:val="0"/>
-                <w:szCs w:val="21"/>
-              </w:rPr>
-              <w:t>分）：</w:t>
-            </w:r>
-            <w:r>
-              <w:rPr>
-                <w:rFonts w:ascii="Calibri" w:hAnsi="Calibri" w:eastAsia="仿宋" w:cs="Calibri"/>
-                <w:kern w:val="0"/>
-                <w:szCs w:val="21"/>
-              </w:rPr>
-              <w:t> </w:t>
-            </w:r>
-            <w:r>
-              <w:rPr>
-                <w:rFonts w:hint="eastAsia" w:ascii="仿宋" w:hAnsi="仿宋" w:eastAsia="仿宋" w:cs="宋体"/>
-                <w:szCs w:val="21"/>
-              </w:rPr>
-              <w:t>投标文件根据招标文件要求的内容和格式编制，制作规范、完整；文字、签字、盖章、复印件清晰。</w:t>
-            </w:r>
-          </w:p>
-          <w:p>
-            <w:pPr>
-              <w:widowControl/>
-              <w:spacing w:line="360" w:lineRule="auto"/>
-              <w:rPr>
-                <w:rFonts w:ascii="仿宋" w:hAnsi="仿宋" w:eastAsia="仿宋" w:cs="宋体"/>
-                <w:szCs w:val="21"/>
-              </w:rPr>
-            </w:pPr>
-            <w:r>
-              <w:rPr>
-                <w:rFonts w:ascii="仿宋" w:hAnsi="仿宋" w:eastAsia="仿宋" w:cs="宋体"/>
-                <w:bCs/>
-                <w:kern w:val="0"/>
-                <w:szCs w:val="21"/>
-              </w:rPr>
-              <w:t>良好（</w:t>
-            </w:r>
-            <w:r>
-              <w:rPr>
-                <w:rFonts w:hint="eastAsia" w:ascii="仿宋" w:hAnsi="仿宋" w:eastAsia="仿宋" w:cs="宋体"/>
-                <w:bCs/>
-                <w:kern w:val="0"/>
-                <w:szCs w:val="21"/>
-              </w:rPr>
-              <w:t>3</w:t>
-            </w:r>
-            <w:r>
-              <w:rPr>
-                <w:rFonts w:ascii="仿宋" w:hAnsi="仿宋" w:eastAsia="仿宋" w:cs="宋体"/>
-                <w:bCs/>
-                <w:kern w:val="0"/>
-                <w:szCs w:val="21"/>
-              </w:rPr>
-              <w:t>分）：</w:t>
-            </w:r>
-            <w:r>
-              <w:rPr>
-                <w:rFonts w:ascii="Calibri" w:hAnsi="Calibri" w:eastAsia="仿宋" w:cs="Calibri"/>
-                <w:kern w:val="0"/>
-                <w:szCs w:val="21"/>
-              </w:rPr>
-              <w:t> </w:t>
-            </w:r>
-            <w:r>
-              <w:rPr>
-                <w:rFonts w:hint="eastAsia" w:ascii="仿宋" w:hAnsi="仿宋" w:eastAsia="仿宋" w:cs="宋体"/>
-                <w:szCs w:val="21"/>
-              </w:rPr>
-              <w:t>投标文件根据招标文件要求的内容和格式编制，制作较为规范、完整；文字、签字、盖章、复印件较为清晰。</w:t>
-            </w:r>
-          </w:p>
-          <w:p>
-            <w:pPr>
-              <w:widowControl/>
-              <w:spacing w:line="360" w:lineRule="auto"/>
-              <w:rPr>
-                <w:rFonts w:ascii="仿宋" w:hAnsi="仿宋" w:eastAsia="仿宋" w:cs="宋体"/>
-                <w:szCs w:val="21"/>
-              </w:rPr>
-            </w:pPr>
-            <w:r>
-              <w:rPr>
-                <w:rFonts w:ascii="仿宋" w:hAnsi="仿宋" w:eastAsia="仿宋" w:cs="宋体"/>
-                <w:bCs/>
-                <w:kern w:val="0"/>
-                <w:szCs w:val="21"/>
-              </w:rPr>
-              <w:t>一般（</w:t>
-            </w:r>
-            <w:r>
-              <w:rPr>
-                <w:rFonts w:hint="eastAsia" w:ascii="仿宋" w:hAnsi="仿宋" w:eastAsia="仿宋" w:cs="宋体"/>
-                <w:bCs/>
-                <w:kern w:val="0"/>
-                <w:szCs w:val="21"/>
-              </w:rPr>
-              <w:t>1</w:t>
-            </w:r>
-            <w:r>
-              <w:rPr>
-                <w:rFonts w:ascii="仿宋" w:hAnsi="仿宋" w:eastAsia="仿宋" w:cs="宋体"/>
-                <w:bCs/>
-                <w:kern w:val="0"/>
-                <w:szCs w:val="21"/>
-              </w:rPr>
-              <w:t>分）：</w:t>
-            </w:r>
-            <w:r>
-              <w:rPr>
-                <w:rFonts w:hint="eastAsia" w:ascii="仿宋" w:hAnsi="仿宋" w:eastAsia="仿宋" w:cs="宋体"/>
-                <w:szCs w:val="21"/>
-              </w:rPr>
-              <w:t>投标文件根据招标文件要求的内容和格式编制，制作不够规范、完整；文字、签字、盖章、复印件不够清晰。</w:t>
+            <w:r>
+              <w:t>优秀（5分）： 投标文件根据比选文件要求的内容和格式编制，制作规范、完整；文字、签字、盖章、复印件清晰。</w:t>
+            </w:r>
+          </w:p>
+          <w:p>
+            <w:r>
+              <w:t>良好（3分）： 投标文件根据比选文件要求的内容和格式编制，制作较为规范、完整；文字、签字、盖章、复印件较为清晰。</w:t>
+            </w:r>
+          </w:p>
+          <w:p>
+            <w:r>
+              <w:t>一般（1分）： 投标文件基本按照比选文件要求编制，存在轻微格式或签字盖章瑕疵。</w:t>
+            </w:r>
+          </w:p>
+          <w:p>
+            <w:r>
+              <w:t>较差（0分）： 投标文件编制不规范或存在关键内容缺失、签字盖章不符合要求。</w:t>
             </w:r>
           </w:p>
         </w:tc>
@@ -29248,27 +27639,7 @@
             <w:vAlign w:val="center"/>
           </w:tcPr>
           <w:p>
-            <w:pPr>
-              <w:widowControl/>
-              <w:spacing w:line="520" w:lineRule="exact"/>
-              <w:contextualSpacing/>
-              <w:jc w:val="center"/>
-              <w:rPr>
-                <w:rFonts w:ascii="仿宋" w:hAnsi="仿宋" w:eastAsia="仿宋" w:cs="宋体"/>
-                <w:b/>
-                <w:bCs/>
-                <w:kern w:val="0"/>
-                <w:szCs w:val="21"/>
-              </w:rPr>
-            </w:pPr>
-            <w:r>
-              <w:rPr>
-                <w:rFonts w:hint="eastAsia" w:ascii="仿宋" w:hAnsi="仿宋" w:eastAsia="仿宋" w:cs="宋体"/>
-                <w:b/>
-                <w:bCs/>
-                <w:kern w:val="0"/>
-                <w:szCs w:val="21"/>
-              </w:rPr>
+            <w:r>
               <w:t>5</w:t>
             </w:r>
           </w:p>
@@ -29285,23 +27656,7 @@
             <w:vAlign w:val="center"/>
           </w:tcPr>
           <w:p>
-            <w:pPr>
-              <w:widowControl/>
-              <w:spacing w:line="520" w:lineRule="exact"/>
-              <w:contextualSpacing/>
-              <w:jc w:val="center"/>
-              <w:rPr>
-                <w:rFonts w:ascii="仿宋" w:hAnsi="仿宋" w:eastAsia="仿宋" w:cs="宋体"/>
-                <w:kern w:val="0"/>
-                <w:szCs w:val="21"/>
-              </w:rPr>
-            </w:pPr>
-            <w:r>
-              <w:rPr>
-                <w:rFonts w:ascii="仿宋" w:hAnsi="仿宋" w:eastAsia="仿宋" w:cs="宋体"/>
-                <w:kern w:val="0"/>
-                <w:szCs w:val="21"/>
-              </w:rPr>
+            <w:r>
               <w:t>客观</w:t>
             </w:r>
           </w:p>
@@ -29336,44 +27691,13 @@
             <w:vAlign w:val="center"/>
           </w:tcPr>
           <w:p>
-            <w:pPr>
-              <w:widowControl/>
-              <w:spacing w:line="520" w:lineRule="exact"/>
-              <w:contextualSpacing/>
-              <w:jc w:val="center"/>
-              <w:rPr>
-                <w:rFonts w:ascii="仿宋" w:hAnsi="仿宋" w:eastAsia="仿宋" w:cs="宋体"/>
-                <w:kern w:val="0"/>
-                <w:szCs w:val="21"/>
-              </w:rPr>
-            </w:pPr>
-            <w:r>
-              <w:rPr>
-                <w:rFonts w:ascii="仿宋" w:hAnsi="仿宋" w:eastAsia="仿宋" w:cs="宋体"/>
-                <w:bCs/>
-                <w:kern w:val="0"/>
-                <w:szCs w:val="21"/>
-              </w:rPr>
-              <w:t>技术部分 (</w:t>
-            </w:r>
-            <w:r>
-              <w:rPr>
-                <w:rFonts w:ascii="仿宋" w:hAnsi="仿宋" w:eastAsia="仿宋" w:cs="宋体"/>
-                <w:b/>
-                <w:bCs/>
-                <w:kern w:val="0"/>
-                <w:szCs w:val="21"/>
-              </w:rPr>
-              <w:t>55</w:t>
-            </w:r>
-            <w:r>
-              <w:rPr>
-                <w:rFonts w:ascii="仿宋" w:hAnsi="仿宋" w:eastAsia="仿宋" w:cs="宋体"/>
-                <w:bCs/>
-                <w:kern w:val="0"/>
-                <w:szCs w:val="21"/>
-              </w:rPr>
-              <w:t>分)</w:t>
+            <w:r>
+              <w:t>技术部分</w:t>
+            </w:r>
+          </w:p>
+          <w:p>
+            <w:r>
+              <w:t>（55分）</w:t>
             </w:r>
           </w:p>
         </w:tc>
@@ -29389,25 +27713,8 @@
             <w:vAlign w:val="center"/>
           </w:tcPr>
           <w:p>
-            <w:pPr>
-              <w:widowControl/>
-              <w:spacing w:line="520" w:lineRule="exact"/>
-              <w:contextualSpacing/>
-              <w:jc w:val="center"/>
-              <w:rPr>
-                <w:rFonts w:ascii="仿宋" w:hAnsi="仿宋" w:eastAsia="仿宋" w:cs="宋体"/>
-                <w:kern w:val="0"/>
-                <w:szCs w:val="21"/>
-              </w:rPr>
-            </w:pPr>
-            <w:r>
-              <w:rPr>
-                <w:rFonts w:ascii="仿宋" w:hAnsi="仿宋" w:eastAsia="仿宋" w:cs="宋体"/>
-                <w:bCs/>
-                <w:kern w:val="0"/>
-                <w:szCs w:val="21"/>
-              </w:rPr>
-              <w:t>服务方案整体策划</w:t>
+            <w:r>
+              <w:t>服务内容与服务方案</w:t>
             </w:r>
           </w:p>
         </w:tc>
@@ -29423,232 +27730,53 @@
             <w:vAlign w:val="center"/>
           </w:tcPr>
           <w:p>
-            <w:pPr>
-              <w:widowControl/>
-              <w:spacing w:line="520" w:lineRule="exact"/>
-              <w:contextualSpacing/>
-              <w:jc w:val="left"/>
-              <w:rPr>
-                <w:rFonts w:ascii="仿宋" w:hAnsi="仿宋" w:eastAsia="仿宋" w:cs="宋体"/>
-                <w:kern w:val="0"/>
-                <w:szCs w:val="21"/>
-              </w:rPr>
-            </w:pPr>
-            <w:r>
-              <w:rPr>
-                <w:rFonts w:ascii="仿宋" w:hAnsi="仿宋" w:eastAsia="仿宋" w:cs="宋体"/>
-                <w:kern w:val="0"/>
-                <w:szCs w:val="21"/>
-              </w:rPr>
-              <w:t>根据对项目需求的理解深度、整体服务流程（前期策划、现场执行、后期制作、交付验收）的合理性、各环节衔接与风险管控措施的完备性进行综合评定：</w:t>
-            </w:r>
-            <w:r>
-              <w:rPr>
-                <w:rFonts w:ascii="仿宋" w:hAnsi="仿宋" w:eastAsia="仿宋" w:cs="宋体"/>
-                <w:kern w:val="0"/>
-                <w:szCs w:val="21"/>
-              </w:rPr>
-              <w:br w:type="textWrapping"/>
-            </w:r>
-            <w:r>
-              <w:rPr>
-                <w:rFonts w:ascii="仿宋" w:hAnsi="仿宋" w:eastAsia="仿宋" w:cs="宋体"/>
-                <w:bCs/>
-                <w:kern w:val="0"/>
-                <w:szCs w:val="21"/>
-              </w:rPr>
-              <w:t>优秀（</w:t>
-            </w:r>
-            <w:r>
-              <w:rPr>
-                <w:rFonts w:ascii="仿宋" w:hAnsi="仿宋" w:eastAsia="仿宋" w:cs="宋体"/>
-                <w:b/>
-                <w:bCs/>
-                <w:kern w:val="0"/>
-                <w:szCs w:val="21"/>
-              </w:rPr>
-              <w:t>15</w:t>
-            </w:r>
-            <w:r>
-              <w:rPr>
-                <w:rFonts w:ascii="仿宋" w:hAnsi="仿宋" w:eastAsia="仿宋" w:cs="宋体"/>
-                <w:bCs/>
-                <w:kern w:val="0"/>
-                <w:szCs w:val="21"/>
-              </w:rPr>
-              <w:t>分）：</w:t>
-            </w:r>
-            <w:r>
-              <w:rPr>
-                <w:rFonts w:ascii="Calibri" w:hAnsi="Calibri" w:eastAsia="仿宋" w:cs="Calibri"/>
-                <w:kern w:val="0"/>
-                <w:szCs w:val="21"/>
-              </w:rPr>
-              <w:t> </w:t>
-            </w:r>
-            <w:r>
-              <w:rPr>
-                <w:rFonts w:ascii="仿宋" w:hAnsi="仿宋" w:eastAsia="仿宋" w:cs="宋体"/>
-                <w:kern w:val="0"/>
-                <w:szCs w:val="21"/>
-              </w:rPr>
-              <w:t>理解深刻，流程完整严谨，衔接无缝，风险预案具体有效。</w:t>
-            </w:r>
-            <w:r>
-              <w:rPr>
-                <w:rFonts w:ascii="仿宋" w:hAnsi="仿宋" w:eastAsia="仿宋" w:cs="宋体"/>
-                <w:kern w:val="0"/>
-                <w:szCs w:val="21"/>
-              </w:rPr>
-              <w:br w:type="textWrapping"/>
-            </w:r>
-            <w:r>
-              <w:rPr>
-                <w:rFonts w:ascii="仿宋" w:hAnsi="仿宋" w:eastAsia="仿宋" w:cs="宋体"/>
-                <w:bCs/>
-                <w:kern w:val="0"/>
-                <w:szCs w:val="21"/>
-              </w:rPr>
-              <w:t>良好（</w:t>
-            </w:r>
-            <w:r>
-              <w:rPr>
-                <w:rFonts w:ascii="仿宋" w:hAnsi="仿宋" w:eastAsia="仿宋" w:cs="宋体"/>
-                <w:b/>
-                <w:bCs/>
-                <w:kern w:val="0"/>
-                <w:szCs w:val="21"/>
-              </w:rPr>
-              <w:t>10</w:t>
-            </w:r>
-            <w:r>
-              <w:rPr>
-                <w:rFonts w:ascii="仿宋" w:hAnsi="仿宋" w:eastAsia="仿宋" w:cs="宋体"/>
-                <w:bCs/>
-                <w:kern w:val="0"/>
-                <w:szCs w:val="21"/>
-              </w:rPr>
-              <w:t>分）：</w:t>
-            </w:r>
-            <w:r>
-              <w:rPr>
-                <w:rFonts w:ascii="Calibri" w:hAnsi="Calibri" w:eastAsia="仿宋" w:cs="Calibri"/>
-                <w:kern w:val="0"/>
-                <w:szCs w:val="21"/>
-              </w:rPr>
-              <w:t> </w:t>
-            </w:r>
-            <w:r>
-              <w:rPr>
-                <w:rFonts w:ascii="仿宋" w:hAnsi="仿宋" w:eastAsia="仿宋" w:cs="宋体"/>
-                <w:kern w:val="0"/>
-                <w:szCs w:val="21"/>
-              </w:rPr>
-              <w:t>理解准确，流程合理，衔接顺畅，有基本风险意识。</w:t>
-            </w:r>
-            <w:r>
-              <w:rPr>
-                <w:rFonts w:ascii="仿宋" w:hAnsi="仿宋" w:eastAsia="仿宋" w:cs="宋体"/>
-                <w:kern w:val="0"/>
-                <w:szCs w:val="21"/>
-              </w:rPr>
-              <w:br w:type="textWrapping"/>
-            </w:r>
-            <w:r>
-              <w:rPr>
-                <w:rFonts w:ascii="仿宋" w:hAnsi="仿宋" w:eastAsia="仿宋" w:cs="宋体"/>
-                <w:bCs/>
-                <w:kern w:val="0"/>
-                <w:szCs w:val="21"/>
-              </w:rPr>
-              <w:t>一般（</w:t>
-            </w:r>
-            <w:r>
-              <w:rPr>
-                <w:rFonts w:ascii="仿宋" w:hAnsi="仿宋" w:eastAsia="仿宋" w:cs="宋体"/>
-                <w:b/>
-                <w:bCs/>
-                <w:kern w:val="0"/>
-                <w:szCs w:val="21"/>
-              </w:rPr>
-              <w:t>5</w:t>
-            </w:r>
-            <w:r>
-              <w:rPr>
-                <w:rFonts w:ascii="仿宋" w:hAnsi="仿宋" w:eastAsia="仿宋" w:cs="宋体"/>
-                <w:bCs/>
-                <w:kern w:val="0"/>
-                <w:szCs w:val="21"/>
-              </w:rPr>
-              <w:t>分）：</w:t>
-            </w:r>
-            <w:r>
-              <w:rPr>
-                <w:rFonts w:ascii="Calibri" w:hAnsi="Calibri" w:eastAsia="仿宋" w:cs="Calibri"/>
-                <w:kern w:val="0"/>
-                <w:szCs w:val="21"/>
-              </w:rPr>
-              <w:t> </w:t>
-            </w:r>
-            <w:r>
-              <w:rPr>
-                <w:rFonts w:ascii="仿宋" w:hAnsi="仿宋" w:eastAsia="仿宋" w:cs="宋体"/>
-                <w:kern w:val="0"/>
-                <w:szCs w:val="21"/>
-              </w:rPr>
-              <w:t>理解基本正确，流程大致可行，衔接和风险考虑一般。</w:t>
-            </w:r>
-            <w:r>
-              <w:rPr>
-                <w:rFonts w:ascii="仿宋" w:hAnsi="仿宋" w:eastAsia="仿宋" w:cs="宋体"/>
-                <w:kern w:val="0"/>
-                <w:szCs w:val="21"/>
-              </w:rPr>
-              <w:br w:type="textWrapping"/>
-            </w:r>
-            <w:r>
-              <w:rPr>
-                <w:rFonts w:ascii="仿宋" w:hAnsi="仿宋" w:eastAsia="仿宋" w:cs="宋体"/>
-                <w:bCs/>
-                <w:kern w:val="0"/>
-                <w:szCs w:val="21"/>
-              </w:rPr>
-              <w:t>较差（</w:t>
-            </w:r>
-            <w:r>
-              <w:rPr>
-                <w:rFonts w:ascii="仿宋" w:hAnsi="仿宋" w:eastAsia="仿宋" w:cs="宋体"/>
-                <w:b/>
-                <w:bCs/>
-                <w:kern w:val="0"/>
-                <w:szCs w:val="21"/>
-              </w:rPr>
-              <w:t>0</w:t>
-            </w:r>
-            <w:r>
-              <w:rPr>
-                <w:rFonts w:ascii="仿宋" w:hAnsi="仿宋" w:eastAsia="仿宋" w:cs="宋体"/>
-                <w:bCs/>
-                <w:kern w:val="0"/>
-                <w:szCs w:val="21"/>
-              </w:rPr>
-              <w:t>分）：</w:t>
-            </w:r>
-            <w:r>
-              <w:rPr>
-                <w:rFonts w:ascii="Calibri" w:hAnsi="Calibri" w:eastAsia="仿宋" w:cs="Calibri"/>
-                <w:kern w:val="0"/>
-                <w:szCs w:val="21"/>
-              </w:rPr>
-              <w:t> </w:t>
-            </w:r>
-            <w:r>
-              <w:rPr>
-                <w:rFonts w:ascii="仿宋" w:hAnsi="仿宋" w:eastAsia="仿宋" w:cs="宋体"/>
-                <w:kern w:val="0"/>
-                <w:szCs w:val="21"/>
-              </w:rPr>
-              <w:t>理解有偏差，流程存在明显缺失或不可行。</w:t>
+            <w:r>
+              <w:t>依据比选文件"五、服务内容及服务范围（一）服务内容及要求"，对参选人围绕义齿加工系统的软件开发、维护服务、功能应用及功能接口所提交的服务方案进行综合评定，重点考察：</w:t>
+            </w:r>
+          </w:p>
+          <w:p>
+            <w:r>
+              <w:t>① 数据库运维管理方案（数据库维护、性能调优、存储空间管理、独立非数据库增量备份与按时间点回滚、多院区差异加密备份及任意备份点全量还原能力）；</w:t>
+            </w:r>
+          </w:p>
+          <w:p>
+            <w:r>
+              <w:t>② 数据集成引擎及数据中心数据维护方案（运行监控、数据集成故障处理、bug修复、数据验证）；</w:t>
+            </w:r>
+          </w:p>
+          <w:p>
+            <w:r>
+              <w:t>③ 数据审计与纠错方案（加工单变更加密日志解密与解析、数据审计报告、完整性/合法性/一致性校验、异常数据分级预警与纠偏策略、可审计可追溯）；</w:t>
+            </w:r>
+          </w:p>
+          <w:p>
+            <w:r>
+              <w:t>④ 应用运维管理方案（系统运行监控、医院培训指导、医院管理、BUG修复及后台数据处理）；</w:t>
+            </w:r>
+          </w:p>
+          <w:p>
+            <w:r>
+              <w:t>⑤ 系统培训方案（使用培训、系统管理培训、甲方技术人员开发维护培训、第三方支撑软件培训）。</w:t>
+            </w:r>
+          </w:p>
+          <w:p>
+            <w:r>
+              <w:t>优秀（20分）： 对服务内容理解深刻，各环节方案完整、针对性强、措施具体可行。</w:t>
+            </w:r>
+          </w:p>
+          <w:p>
+            <w:r>
+              <w:t>良好（14分）： 对服务内容理解较好，各环节方案较完整、具有可行性。</w:t>
+            </w:r>
+          </w:p>
+          <w:p>
+            <w:r>
+              <w:t>一般（7分）： 方案基本覆盖服务内容，针对性与可行性一般。</w:t>
+            </w:r>
+          </w:p>
+          <w:p>
+            <w:r>
+              <w:t>较差（0分）： 方案缺失关键内容或针对性差。</w:t>
             </w:r>
           </w:p>
         </w:tc>
@@ -29664,26 +27792,8 @@
             <w:vAlign w:val="center"/>
           </w:tcPr>
           <w:p>
-            <w:pPr>
-              <w:widowControl/>
-              <w:spacing w:line="520" w:lineRule="exact"/>
-              <w:contextualSpacing/>
-              <w:jc w:val="center"/>
-              <w:rPr>
-                <w:rFonts w:ascii="仿宋" w:hAnsi="仿宋" w:eastAsia="仿宋" w:cs="宋体"/>
-                <w:kern w:val="0"/>
-                <w:szCs w:val="21"/>
-              </w:rPr>
-            </w:pPr>
-            <w:r>
-              <w:rPr>
-                <w:rFonts w:ascii="仿宋" w:hAnsi="仿宋" w:eastAsia="仿宋" w:cs="宋体"/>
-                <w:b/>
-                <w:bCs/>
-                <w:kern w:val="0"/>
-                <w:szCs w:val="21"/>
-              </w:rPr>
-              <w:t>15</w:t>
+            <w:r>
+              <w:t>20</w:t>
             </w:r>
           </w:p>
         </w:tc>
@@ -29699,23 +27809,7 @@
             <w:vAlign w:val="center"/>
           </w:tcPr>
           <w:p>
-            <w:pPr>
-              <w:widowControl/>
-              <w:spacing w:line="520" w:lineRule="exact"/>
-              <w:contextualSpacing/>
-              <w:jc w:val="center"/>
-              <w:rPr>
-                <w:rFonts w:ascii="仿宋" w:hAnsi="仿宋" w:eastAsia="仿宋" w:cs="宋体"/>
-                <w:kern w:val="0"/>
-                <w:szCs w:val="21"/>
-              </w:rPr>
-            </w:pPr>
-            <w:r>
-              <w:rPr>
-                <w:rFonts w:ascii="仿宋" w:hAnsi="仿宋" w:eastAsia="仿宋" w:cs="宋体"/>
-                <w:kern w:val="0"/>
-                <w:szCs w:val="21"/>
-              </w:rPr>
+            <w:r>
               <w:t>主观</w:t>
             </w:r>
           </w:p>
@@ -29750,17 +27844,7 @@
             <w:vAlign w:val="center"/>
           </w:tcPr>
           <w:p>
-            <w:pPr>
-              <w:widowControl/>
-              <w:spacing w:line="520" w:lineRule="exact"/>
-              <w:contextualSpacing/>
-              <w:jc w:val="center"/>
-              <w:rPr>
-                <w:rFonts w:ascii="仿宋" w:hAnsi="仿宋" w:eastAsia="仿宋" w:cs="宋体"/>
-                <w:kern w:val="0"/>
-                <w:szCs w:val="21"/>
-              </w:rPr>
-            </w:pPr>
+            <w:r/>
           </w:p>
         </w:tc>
         <w:tc>
@@ -29775,25 +27859,8 @@
             <w:vAlign w:val="center"/>
           </w:tcPr>
           <w:p>
-            <w:pPr>
-              <w:widowControl/>
-              <w:spacing w:line="520" w:lineRule="exact"/>
-              <w:contextualSpacing/>
-              <w:jc w:val="center"/>
-              <w:rPr>
-                <w:rFonts w:ascii="仿宋" w:hAnsi="仿宋" w:eastAsia="仿宋" w:cs="宋体"/>
-                <w:kern w:val="0"/>
-                <w:szCs w:val="21"/>
-              </w:rPr>
-            </w:pPr>
-            <w:r>
-              <w:rPr>
-                <w:rFonts w:ascii="仿宋" w:hAnsi="仿宋" w:eastAsia="仿宋" w:cs="宋体"/>
-                <w:bCs/>
-                <w:kern w:val="0"/>
-                <w:szCs w:val="21"/>
-              </w:rPr>
-              <w:t>影像制作技术方案</w:t>
+            <w:r>
+              <w:t>服务要求及知识产权保障方案</w:t>
             </w:r>
           </w:p>
         </w:tc>
@@ -29809,232 +27876,43 @@
             <w:vAlign w:val="center"/>
           </w:tcPr>
           <w:p>
-            <w:pPr>
-              <w:widowControl/>
-              <w:spacing w:line="520" w:lineRule="exact"/>
-              <w:contextualSpacing/>
-              <w:jc w:val="left"/>
-              <w:rPr>
-                <w:rFonts w:ascii="仿宋" w:hAnsi="仿宋" w:eastAsia="仿宋" w:cs="宋体"/>
-                <w:kern w:val="0"/>
-                <w:szCs w:val="21"/>
-              </w:rPr>
-            </w:pPr>
-            <w:r>
-              <w:rPr>
-                <w:rFonts w:ascii="仿宋" w:hAnsi="仿宋" w:eastAsia="仿宋" w:cs="宋体"/>
-                <w:kern w:val="0"/>
-                <w:szCs w:val="21"/>
-              </w:rPr>
-              <w:t>针对“两场比赛全程纪实”与“15位演讲人二次创作”，从创意构思、镜头语言设计、现场多机位调度方案、后期剪辑与包装思路、音画质量标准及风格统一性等方面进行综合评定：</w:t>
-            </w:r>
-            <w:r>
-              <w:rPr>
-                <w:rFonts w:ascii="仿宋" w:hAnsi="仿宋" w:eastAsia="仿宋" w:cs="宋体"/>
-                <w:kern w:val="0"/>
-                <w:szCs w:val="21"/>
-              </w:rPr>
-              <w:br w:type="textWrapping"/>
-            </w:r>
-            <w:r>
-              <w:rPr>
-                <w:rFonts w:ascii="仿宋" w:hAnsi="仿宋" w:eastAsia="仿宋" w:cs="宋体"/>
-                <w:bCs/>
-                <w:kern w:val="0"/>
-                <w:szCs w:val="21"/>
-              </w:rPr>
-              <w:t>优秀（</w:t>
-            </w:r>
-            <w:r>
-              <w:rPr>
-                <w:rFonts w:ascii="仿宋" w:hAnsi="仿宋" w:eastAsia="仿宋" w:cs="宋体"/>
-                <w:b/>
-                <w:bCs/>
-                <w:kern w:val="0"/>
-                <w:szCs w:val="21"/>
-              </w:rPr>
-              <w:t>15</w:t>
-            </w:r>
-            <w:r>
-              <w:rPr>
-                <w:rFonts w:ascii="仿宋" w:hAnsi="仿宋" w:eastAsia="仿宋" w:cs="宋体"/>
-                <w:bCs/>
-                <w:kern w:val="0"/>
-                <w:szCs w:val="21"/>
-              </w:rPr>
-              <w:t>分）：</w:t>
-            </w:r>
-            <w:r>
-              <w:rPr>
-                <w:rFonts w:ascii="Calibri" w:hAnsi="Calibri" w:eastAsia="仿宋" w:cs="Calibri"/>
-                <w:kern w:val="0"/>
-                <w:szCs w:val="21"/>
-              </w:rPr>
-              <w:t> </w:t>
-            </w:r>
-            <w:r>
-              <w:rPr>
-                <w:rFonts w:ascii="仿宋" w:hAnsi="仿宋" w:eastAsia="仿宋" w:cs="宋体"/>
-                <w:kern w:val="0"/>
-                <w:szCs w:val="21"/>
-              </w:rPr>
-              <w:t>创意突出，技术路线清晰先进，可操作性强，能显著提升活动传播效果。</w:t>
-            </w:r>
-            <w:r>
-              <w:rPr>
-                <w:rFonts w:ascii="仿宋" w:hAnsi="仿宋" w:eastAsia="仿宋" w:cs="宋体"/>
-                <w:kern w:val="0"/>
-                <w:szCs w:val="21"/>
-              </w:rPr>
-              <w:br w:type="textWrapping"/>
-            </w:r>
-            <w:r>
-              <w:rPr>
-                <w:rFonts w:ascii="仿宋" w:hAnsi="仿宋" w:eastAsia="仿宋" w:cs="宋体"/>
-                <w:bCs/>
-                <w:kern w:val="0"/>
-                <w:szCs w:val="21"/>
-              </w:rPr>
-              <w:t>良好（</w:t>
-            </w:r>
-            <w:r>
-              <w:rPr>
-                <w:rFonts w:ascii="仿宋" w:hAnsi="仿宋" w:eastAsia="仿宋" w:cs="宋体"/>
-                <w:b/>
-                <w:bCs/>
-                <w:kern w:val="0"/>
-                <w:szCs w:val="21"/>
-              </w:rPr>
-              <w:t>10</w:t>
-            </w:r>
-            <w:r>
-              <w:rPr>
-                <w:rFonts w:ascii="仿宋" w:hAnsi="仿宋" w:eastAsia="仿宋" w:cs="宋体"/>
-                <w:bCs/>
-                <w:kern w:val="0"/>
-                <w:szCs w:val="21"/>
-              </w:rPr>
-              <w:t>分）：</w:t>
-            </w:r>
-            <w:r>
-              <w:rPr>
-                <w:rFonts w:ascii="Calibri" w:hAnsi="Calibri" w:eastAsia="仿宋" w:cs="Calibri"/>
-                <w:kern w:val="0"/>
-                <w:szCs w:val="21"/>
-              </w:rPr>
-              <w:t> </w:t>
-            </w:r>
-            <w:r>
-              <w:rPr>
-                <w:rFonts w:ascii="仿宋" w:hAnsi="仿宋" w:eastAsia="仿宋" w:cs="宋体"/>
-                <w:kern w:val="0"/>
-                <w:szCs w:val="21"/>
-              </w:rPr>
-              <w:t>创意合理，技术路线完整可行，能满足项目基本要求并有一定亮点。</w:t>
-            </w:r>
-            <w:r>
-              <w:rPr>
-                <w:rFonts w:ascii="仿宋" w:hAnsi="仿宋" w:eastAsia="仿宋" w:cs="宋体"/>
-                <w:kern w:val="0"/>
-                <w:szCs w:val="21"/>
-              </w:rPr>
-              <w:br w:type="textWrapping"/>
-            </w:r>
-            <w:r>
-              <w:rPr>
-                <w:rFonts w:ascii="仿宋" w:hAnsi="仿宋" w:eastAsia="仿宋" w:cs="宋体"/>
-                <w:bCs/>
-                <w:kern w:val="0"/>
-                <w:szCs w:val="21"/>
-              </w:rPr>
-              <w:t>一般（</w:t>
-            </w:r>
-            <w:r>
-              <w:rPr>
-                <w:rFonts w:ascii="仿宋" w:hAnsi="仿宋" w:eastAsia="仿宋" w:cs="宋体"/>
-                <w:b/>
-                <w:bCs/>
-                <w:kern w:val="0"/>
-                <w:szCs w:val="21"/>
-              </w:rPr>
-              <w:t>5</w:t>
-            </w:r>
-            <w:r>
-              <w:rPr>
-                <w:rFonts w:ascii="仿宋" w:hAnsi="仿宋" w:eastAsia="仿宋" w:cs="宋体"/>
-                <w:bCs/>
-                <w:kern w:val="0"/>
-                <w:szCs w:val="21"/>
-              </w:rPr>
-              <w:t>分）：</w:t>
-            </w:r>
-            <w:r>
-              <w:rPr>
-                <w:rFonts w:ascii="Calibri" w:hAnsi="Calibri" w:eastAsia="仿宋" w:cs="Calibri"/>
-                <w:kern w:val="0"/>
-                <w:szCs w:val="21"/>
-              </w:rPr>
-              <w:t> </w:t>
-            </w:r>
-            <w:r>
-              <w:rPr>
-                <w:rFonts w:ascii="仿宋" w:hAnsi="仿宋" w:eastAsia="仿宋" w:cs="宋体"/>
-                <w:kern w:val="0"/>
-                <w:szCs w:val="21"/>
-              </w:rPr>
-              <w:t>创意和技术路线常规，能满足基本记录需求。</w:t>
-            </w:r>
-            <w:r>
-              <w:rPr>
-                <w:rFonts w:ascii="仿宋" w:hAnsi="仿宋" w:eastAsia="仿宋" w:cs="宋体"/>
-                <w:kern w:val="0"/>
-                <w:szCs w:val="21"/>
-              </w:rPr>
-              <w:br w:type="textWrapping"/>
-            </w:r>
-            <w:r>
-              <w:rPr>
-                <w:rFonts w:ascii="仿宋" w:hAnsi="仿宋" w:eastAsia="仿宋" w:cs="宋体"/>
-                <w:bCs/>
-                <w:kern w:val="0"/>
-                <w:szCs w:val="21"/>
-              </w:rPr>
-              <w:t>较差（</w:t>
-            </w:r>
-            <w:r>
-              <w:rPr>
-                <w:rFonts w:ascii="仿宋" w:hAnsi="仿宋" w:eastAsia="仿宋" w:cs="宋体"/>
-                <w:b/>
-                <w:bCs/>
-                <w:kern w:val="0"/>
-                <w:szCs w:val="21"/>
-              </w:rPr>
-              <w:t>0</w:t>
-            </w:r>
-            <w:r>
-              <w:rPr>
-                <w:rFonts w:ascii="仿宋" w:hAnsi="仿宋" w:eastAsia="仿宋" w:cs="宋体"/>
-                <w:bCs/>
-                <w:kern w:val="0"/>
-                <w:szCs w:val="21"/>
-              </w:rPr>
-              <w:t>分）：</w:t>
-            </w:r>
-            <w:r>
-              <w:rPr>
-                <w:rFonts w:ascii="Calibri" w:hAnsi="Calibri" w:eastAsia="仿宋" w:cs="Calibri"/>
-                <w:kern w:val="0"/>
-                <w:szCs w:val="21"/>
-              </w:rPr>
-              <w:t> </w:t>
-            </w:r>
-            <w:r>
-              <w:rPr>
-                <w:rFonts w:ascii="仿宋" w:hAnsi="仿宋" w:eastAsia="仿宋" w:cs="宋体"/>
-                <w:kern w:val="0"/>
-                <w:szCs w:val="21"/>
-              </w:rPr>
-              <w:t>方案简单粗糙，缺乏针对性或存在明显技术缺陷。</w:t>
+            <w:r>
+              <w:t>依据比选文件"五、服务内容及服务范围（二）服务要求及知识产权"，对参选人以下措施进行综合评定：</w:t>
+            </w:r>
+          </w:p>
+          <w:p>
+            <w:r>
+              <w:t>① 7*24*365小时系统原厂服务承诺及年度系统运行质量报告机制；</w:t>
+            </w:r>
+          </w:p>
+          <w:p>
+            <w:r>
+              <w:t>② 定期与医院工作人员沟通并提供最新软件解决方案的工作机制；</w:t>
+            </w:r>
+          </w:p>
+          <w:p>
+            <w:r>
+              <w:t>③ 软件维保记录的形成、整理与向医院移交的流程；</w:t>
+            </w:r>
+          </w:p>
+          <w:p>
+            <w:r>
+              <w:t>④ 工程师遵守医院规章制度、签订信息安全保密协议的管理要求；</w:t>
+            </w:r>
+          </w:p>
+          <w:p>
+            <w:r>
+              <w:t>⑤ 知识产权及数据归属管理措施（系统中资料、数据等知识产权归医院所有，未经允许不得复制、传播、转让、许可或提供他人使用；明确因违反保密与制度引发核心系统故障、数据丢失及泄密等情形下的法律责任）。</w:t>
+            </w:r>
+          </w:p>
+          <w:p>
+            <w:r>
+              <w:t>优秀（10分）： 措施齐全，机制明确可执行；良好（7分）： 措施较齐全，机制较明确；</w:t>
+            </w:r>
+          </w:p>
+          <w:p>
+            <w:r>
+              <w:t>一般（4分）： 措施基本满足；较差（0分）： 措施缺失或不可执行。</w:t>
             </w:r>
           </w:p>
         </w:tc>
@@ -30050,26 +27928,8 @@
             <w:vAlign w:val="center"/>
           </w:tcPr>
           <w:p>
-            <w:pPr>
-              <w:widowControl/>
-              <w:spacing w:line="520" w:lineRule="exact"/>
-              <w:contextualSpacing/>
-              <w:jc w:val="center"/>
-              <w:rPr>
-                <w:rFonts w:ascii="仿宋" w:hAnsi="仿宋" w:eastAsia="仿宋" w:cs="宋体"/>
-                <w:kern w:val="0"/>
-                <w:szCs w:val="21"/>
-              </w:rPr>
-            </w:pPr>
-            <w:r>
-              <w:rPr>
-                <w:rFonts w:ascii="仿宋" w:hAnsi="仿宋" w:eastAsia="仿宋" w:cs="宋体"/>
-                <w:b/>
-                <w:bCs/>
-                <w:kern w:val="0"/>
-                <w:szCs w:val="21"/>
-              </w:rPr>
-              <w:t>15</w:t>
+            <w:r>
+              <w:t>10</w:t>
             </w:r>
           </w:p>
         </w:tc>
@@ -30085,23 +27945,7 @@
             <w:vAlign w:val="center"/>
           </w:tcPr>
           <w:p>
-            <w:pPr>
-              <w:widowControl/>
-              <w:spacing w:line="520" w:lineRule="exact"/>
-              <w:contextualSpacing/>
-              <w:jc w:val="center"/>
-              <w:rPr>
-                <w:rFonts w:ascii="仿宋" w:hAnsi="仿宋" w:eastAsia="仿宋" w:cs="宋体"/>
-                <w:kern w:val="0"/>
-                <w:szCs w:val="21"/>
-              </w:rPr>
-            </w:pPr>
-            <w:r>
-              <w:rPr>
-                <w:rFonts w:ascii="仿宋" w:hAnsi="仿宋" w:eastAsia="仿宋" w:cs="宋体"/>
-                <w:kern w:val="0"/>
-                <w:szCs w:val="21"/>
-              </w:rPr>
+            <w:r>
               <w:t>主观</w:t>
             </w:r>
           </w:p>
@@ -30136,17 +27980,7 @@
             <w:vAlign w:val="center"/>
           </w:tcPr>
           <w:p>
-            <w:pPr>
-              <w:widowControl/>
-              <w:spacing w:line="520" w:lineRule="exact"/>
-              <w:contextualSpacing/>
-              <w:jc w:val="center"/>
-              <w:rPr>
-                <w:rFonts w:ascii="仿宋" w:hAnsi="仿宋" w:eastAsia="仿宋" w:cs="宋体"/>
-                <w:kern w:val="0"/>
-                <w:szCs w:val="21"/>
-              </w:rPr>
-            </w:pPr>
+            <w:r/>
           </w:p>
         </w:tc>
         <w:tc>
@@ -30161,25 +27995,8 @@
             <w:vAlign w:val="center"/>
           </w:tcPr>
           <w:p>
-            <w:pPr>
-              <w:widowControl/>
-              <w:spacing w:line="520" w:lineRule="exact"/>
-              <w:contextualSpacing/>
-              <w:jc w:val="center"/>
-              <w:rPr>
-                <w:rFonts w:ascii="仿宋" w:hAnsi="仿宋" w:eastAsia="仿宋" w:cs="宋体"/>
-                <w:kern w:val="0"/>
-                <w:szCs w:val="21"/>
-              </w:rPr>
-            </w:pPr>
-            <w:r>
-              <w:rPr>
-                <w:rFonts w:ascii="仿宋" w:hAnsi="仿宋" w:eastAsia="仿宋" w:cs="宋体"/>
-                <w:bCs/>
-                <w:kern w:val="0"/>
-                <w:szCs w:val="21"/>
-              </w:rPr>
-              <w:t>视觉设计创意方案</w:t>
+            <w:r>
+              <w:t>服务质量保障方案</w:t>
             </w:r>
           </w:p>
         </w:tc>
@@ -30195,232 +28012,43 @@
             <w:vAlign w:val="center"/>
           </w:tcPr>
           <w:p>
-            <w:pPr>
-              <w:widowControl/>
-              <w:spacing w:line="520" w:lineRule="exact"/>
-              <w:contextualSpacing/>
-              <w:jc w:val="left"/>
-              <w:rPr>
-                <w:rFonts w:ascii="仿宋" w:hAnsi="仿宋" w:eastAsia="仿宋" w:cs="宋体"/>
-                <w:kern w:val="0"/>
-                <w:szCs w:val="21"/>
-              </w:rPr>
-            </w:pPr>
-            <w:r>
-              <w:rPr>
-                <w:rFonts w:ascii="仿宋" w:hAnsi="仿宋" w:eastAsia="仿宋" w:cs="宋体"/>
-                <w:kern w:val="0"/>
-                <w:szCs w:val="21"/>
-              </w:rPr>
-              <w:t>针对宣传海报、电子请柬、现场大屏背景等视觉物料，从设计创意、与“首都医科大学附属北京口腔医院”品牌形象的契合度、与演讲比赛主题的呼应、以及整体视觉体系的统一性进行综合评定：</w:t>
-            </w:r>
-            <w:r>
-              <w:rPr>
-                <w:rFonts w:ascii="仿宋" w:hAnsi="仿宋" w:eastAsia="仿宋" w:cs="宋体"/>
-                <w:kern w:val="0"/>
-                <w:szCs w:val="21"/>
-              </w:rPr>
-              <w:br w:type="textWrapping"/>
-            </w:r>
-            <w:r>
-              <w:rPr>
-                <w:rFonts w:ascii="仿宋" w:hAnsi="仿宋" w:eastAsia="仿宋" w:cs="宋体"/>
-                <w:bCs/>
-                <w:kern w:val="0"/>
-                <w:szCs w:val="21"/>
-              </w:rPr>
-              <w:t>优秀（</w:t>
-            </w:r>
-            <w:r>
-              <w:rPr>
-                <w:rFonts w:ascii="仿宋" w:hAnsi="仿宋" w:eastAsia="仿宋" w:cs="宋体"/>
-                <w:b/>
-                <w:bCs/>
-                <w:kern w:val="0"/>
-                <w:szCs w:val="21"/>
-              </w:rPr>
-              <w:t>15</w:t>
-            </w:r>
-            <w:r>
-              <w:rPr>
-                <w:rFonts w:ascii="仿宋" w:hAnsi="仿宋" w:eastAsia="仿宋" w:cs="宋体"/>
-                <w:bCs/>
-                <w:kern w:val="0"/>
-                <w:szCs w:val="21"/>
-              </w:rPr>
-              <w:t>分）：</w:t>
-            </w:r>
-            <w:r>
-              <w:rPr>
-                <w:rFonts w:ascii="Calibri" w:hAnsi="Calibri" w:eastAsia="仿宋" w:cs="Calibri"/>
-                <w:kern w:val="0"/>
-                <w:szCs w:val="21"/>
-              </w:rPr>
-              <w:t> </w:t>
-            </w:r>
-            <w:r>
-              <w:rPr>
-                <w:rFonts w:ascii="仿宋" w:hAnsi="仿宋" w:eastAsia="仿宋" w:cs="宋体"/>
-                <w:kern w:val="0"/>
-                <w:szCs w:val="21"/>
-              </w:rPr>
-              <w:t>创意新颖且贴合主题，品牌融合度高，视觉表现力强，体系统一。</w:t>
-            </w:r>
-            <w:r>
-              <w:rPr>
-                <w:rFonts w:ascii="仿宋" w:hAnsi="仿宋" w:eastAsia="仿宋" w:cs="宋体"/>
-                <w:kern w:val="0"/>
-                <w:szCs w:val="21"/>
-              </w:rPr>
-              <w:br w:type="textWrapping"/>
-            </w:r>
-            <w:r>
-              <w:rPr>
-                <w:rFonts w:ascii="仿宋" w:hAnsi="仿宋" w:eastAsia="仿宋" w:cs="宋体"/>
-                <w:bCs/>
-                <w:kern w:val="0"/>
-                <w:szCs w:val="21"/>
-              </w:rPr>
-              <w:t>良好（</w:t>
-            </w:r>
-            <w:r>
-              <w:rPr>
-                <w:rFonts w:ascii="仿宋" w:hAnsi="仿宋" w:eastAsia="仿宋" w:cs="宋体"/>
-                <w:b/>
-                <w:bCs/>
-                <w:kern w:val="0"/>
-                <w:szCs w:val="21"/>
-              </w:rPr>
-              <w:t>10</w:t>
-            </w:r>
-            <w:r>
-              <w:rPr>
-                <w:rFonts w:ascii="仿宋" w:hAnsi="仿宋" w:eastAsia="仿宋" w:cs="宋体"/>
-                <w:bCs/>
-                <w:kern w:val="0"/>
-                <w:szCs w:val="21"/>
-              </w:rPr>
-              <w:t>分）：</w:t>
-            </w:r>
-            <w:r>
-              <w:rPr>
-                <w:rFonts w:ascii="Calibri" w:hAnsi="Calibri" w:eastAsia="仿宋" w:cs="Calibri"/>
-                <w:kern w:val="0"/>
-                <w:szCs w:val="21"/>
-              </w:rPr>
-              <w:t> </w:t>
-            </w:r>
-            <w:r>
-              <w:rPr>
-                <w:rFonts w:ascii="仿宋" w:hAnsi="仿宋" w:eastAsia="仿宋" w:cs="宋体"/>
-                <w:kern w:val="0"/>
-                <w:szCs w:val="21"/>
-              </w:rPr>
-              <w:t>创意良好，符合品牌要求与活动主题，视觉体系协调。</w:t>
-            </w:r>
-            <w:r>
-              <w:rPr>
-                <w:rFonts w:ascii="仿宋" w:hAnsi="仿宋" w:eastAsia="仿宋" w:cs="宋体"/>
-                <w:kern w:val="0"/>
-                <w:szCs w:val="21"/>
-              </w:rPr>
-              <w:br w:type="textWrapping"/>
-            </w:r>
-            <w:r>
-              <w:rPr>
-                <w:rFonts w:ascii="仿宋" w:hAnsi="仿宋" w:eastAsia="仿宋" w:cs="宋体"/>
-                <w:bCs/>
-                <w:kern w:val="0"/>
-                <w:szCs w:val="21"/>
-              </w:rPr>
-              <w:t>一般（</w:t>
-            </w:r>
-            <w:r>
-              <w:rPr>
-                <w:rFonts w:ascii="仿宋" w:hAnsi="仿宋" w:eastAsia="仿宋" w:cs="宋体"/>
-                <w:b/>
-                <w:bCs/>
-                <w:kern w:val="0"/>
-                <w:szCs w:val="21"/>
-              </w:rPr>
-              <w:t>5</w:t>
-            </w:r>
-            <w:r>
-              <w:rPr>
-                <w:rFonts w:ascii="仿宋" w:hAnsi="仿宋" w:eastAsia="仿宋" w:cs="宋体"/>
-                <w:bCs/>
-                <w:kern w:val="0"/>
-                <w:szCs w:val="21"/>
-              </w:rPr>
-              <w:t>分）：</w:t>
-            </w:r>
-            <w:r>
-              <w:rPr>
-                <w:rFonts w:ascii="Calibri" w:hAnsi="Calibri" w:eastAsia="仿宋" w:cs="Calibri"/>
-                <w:kern w:val="0"/>
-                <w:szCs w:val="21"/>
-              </w:rPr>
-              <w:t> </w:t>
-            </w:r>
-            <w:r>
-              <w:rPr>
-                <w:rFonts w:ascii="仿宋" w:hAnsi="仿宋" w:eastAsia="仿宋" w:cs="宋体"/>
-                <w:kern w:val="0"/>
-                <w:szCs w:val="21"/>
-              </w:rPr>
-              <w:t>创意常规，基本符合要求，无明显不当。</w:t>
-            </w:r>
-            <w:r>
-              <w:rPr>
-                <w:rFonts w:ascii="仿宋" w:hAnsi="仿宋" w:eastAsia="仿宋" w:cs="宋体"/>
-                <w:kern w:val="0"/>
-                <w:szCs w:val="21"/>
-              </w:rPr>
-              <w:br w:type="textWrapping"/>
-            </w:r>
-            <w:r>
-              <w:rPr>
-                <w:rFonts w:ascii="仿宋" w:hAnsi="仿宋" w:eastAsia="仿宋" w:cs="宋体"/>
-                <w:bCs/>
-                <w:kern w:val="0"/>
-                <w:szCs w:val="21"/>
-              </w:rPr>
-              <w:t>较差（</w:t>
-            </w:r>
-            <w:r>
-              <w:rPr>
-                <w:rFonts w:ascii="仿宋" w:hAnsi="仿宋" w:eastAsia="仿宋" w:cs="宋体"/>
-                <w:b/>
-                <w:bCs/>
-                <w:kern w:val="0"/>
-                <w:szCs w:val="21"/>
-              </w:rPr>
-              <w:t>0</w:t>
-            </w:r>
-            <w:r>
-              <w:rPr>
-                <w:rFonts w:ascii="仿宋" w:hAnsi="仿宋" w:eastAsia="仿宋" w:cs="宋体"/>
-                <w:bCs/>
-                <w:kern w:val="0"/>
-                <w:szCs w:val="21"/>
-              </w:rPr>
-              <w:t>分）：</w:t>
-            </w:r>
-            <w:r>
-              <w:rPr>
-                <w:rFonts w:ascii="Calibri" w:hAnsi="Calibri" w:eastAsia="仿宋" w:cs="Calibri"/>
-                <w:kern w:val="0"/>
-                <w:szCs w:val="21"/>
-              </w:rPr>
-              <w:t> </w:t>
-            </w:r>
-            <w:r>
-              <w:rPr>
-                <w:rFonts w:ascii="仿宋" w:hAnsi="仿宋" w:eastAsia="仿宋" w:cs="宋体"/>
-                <w:kern w:val="0"/>
-                <w:szCs w:val="21"/>
-              </w:rPr>
-              <w:t>创意不足或与品牌、主题不符，视觉混乱。</w:t>
+            <w:r>
+              <w:t>依据比选文件"五、服务内容及服务范围（三）服务质量及要求"，对参选人服务质量保障方案进行综合评定：</w:t>
+            </w:r>
+          </w:p>
+          <w:p>
+            <w:r>
+              <w:t>① 电话支持： 服务请求确认机制、规定响应时间、故障定位与解决方案提供流程；</w:t>
+            </w:r>
+          </w:p>
+          <w:p>
+            <w:r>
+              <w:t>② 远程维护： 医院请求确认、远程登录征得同意、数据查看/修改的授权流程、中断系统事先申请、客户现场配合要求及解决方案有效性反馈机制；</w:t>
+            </w:r>
+          </w:p>
+          <w:p>
+            <w:r>
+              <w:t>③ 现场支持： 电话/远程无法解决时的现场响应、故障原因分析、方案批准与实施、中断系统事先申请、故障解决书面分析报告的提交。</w:t>
+            </w:r>
+          </w:p>
+          <w:p>
+            <w:r>
+              <w:t>优秀（15分）： 三级支持流程完整严谨、响应机制明确、执行要点可落实。</w:t>
+            </w:r>
+          </w:p>
+          <w:p>
+            <w:r>
+              <w:t>良好（10分）： 流程较完整、响应机制较明确。</w:t>
+            </w:r>
+          </w:p>
+          <w:p>
+            <w:r>
+              <w:t>一般（5分）： 流程基本满足但细节不足。</w:t>
+            </w:r>
+          </w:p>
+          <w:p>
+            <w:r>
+              <w:t>较差（0分）： 流程缺失或无法落实。</w:t>
             </w:r>
           </w:p>
         </w:tc>
@@ -30436,25 +28064,7 @@
             <w:vAlign w:val="center"/>
           </w:tcPr>
           <w:p>
-            <w:pPr>
-              <w:widowControl/>
-              <w:spacing w:line="520" w:lineRule="exact"/>
-              <w:contextualSpacing/>
-              <w:jc w:val="center"/>
-              <w:rPr>
-                <w:rFonts w:ascii="仿宋" w:hAnsi="仿宋" w:eastAsia="仿宋" w:cs="宋体"/>
-                <w:kern w:val="0"/>
-                <w:szCs w:val="21"/>
-              </w:rPr>
-            </w:pPr>
-            <w:r>
-              <w:rPr>
-                <w:rFonts w:ascii="仿宋" w:hAnsi="仿宋" w:eastAsia="仿宋" w:cs="宋体"/>
-                <w:b/>
-                <w:bCs/>
-                <w:kern w:val="0"/>
-                <w:szCs w:val="21"/>
-              </w:rPr>
+            <w:r>
               <w:t>15</w:t>
             </w:r>
           </w:p>
@@ -30471,23 +28081,7 @@
             <w:vAlign w:val="center"/>
           </w:tcPr>
           <w:p>
-            <w:pPr>
-              <w:widowControl/>
-              <w:spacing w:line="520" w:lineRule="exact"/>
-              <w:contextualSpacing/>
-              <w:jc w:val="center"/>
-              <w:rPr>
-                <w:rFonts w:ascii="仿宋" w:hAnsi="仿宋" w:eastAsia="仿宋" w:cs="宋体"/>
-                <w:kern w:val="0"/>
-                <w:szCs w:val="21"/>
-              </w:rPr>
-            </w:pPr>
-            <w:r>
-              <w:rPr>
-                <w:rFonts w:ascii="仿宋" w:hAnsi="仿宋" w:eastAsia="仿宋" w:cs="宋体"/>
-                <w:kern w:val="0"/>
-                <w:szCs w:val="21"/>
-              </w:rPr>
+            <w:r>
               <w:t>主观</w:t>
             </w:r>
           </w:p>
@@ -30522,17 +28116,7 @@
             <w:vAlign w:val="center"/>
           </w:tcPr>
           <w:p>
-            <w:pPr>
-              <w:widowControl/>
-              <w:spacing w:line="520" w:lineRule="exact"/>
-              <w:contextualSpacing/>
-              <w:jc w:val="center"/>
-              <w:rPr>
-                <w:rFonts w:ascii="仿宋" w:hAnsi="仿宋" w:eastAsia="仿宋" w:cs="宋体"/>
-                <w:kern w:val="0"/>
-                <w:szCs w:val="21"/>
-              </w:rPr>
-            </w:pPr>
+            <w:r/>
           </w:p>
         </w:tc>
         <w:tc>
@@ -30547,25 +28131,8 @@
             <w:vAlign w:val="center"/>
           </w:tcPr>
           <w:p>
-            <w:pPr>
-              <w:widowControl/>
-              <w:spacing w:line="520" w:lineRule="exact"/>
-              <w:contextualSpacing/>
-              <w:jc w:val="center"/>
-              <w:rPr>
-                <w:rFonts w:ascii="仿宋" w:hAnsi="仿宋" w:eastAsia="仿宋" w:cs="宋体"/>
-                <w:kern w:val="0"/>
-                <w:szCs w:val="21"/>
-              </w:rPr>
-            </w:pPr>
-            <w:r>
-              <w:rPr>
-                <w:rFonts w:ascii="仿宋" w:hAnsi="仿宋" w:eastAsia="仿宋" w:cs="宋体"/>
-                <w:bCs/>
-                <w:kern w:val="0"/>
-                <w:szCs w:val="21"/>
-              </w:rPr>
-              <w:t>成果展示（案例）</w:t>
+            <w:r>
+              <w:t>服务保障措施</w:t>
             </w:r>
           </w:p>
         </w:tc>
@@ -30581,249 +28148,28 @@
             <w:vAlign w:val="center"/>
           </w:tcPr>
           <w:p>
-            <w:pPr>
-              <w:widowControl/>
-              <w:spacing w:line="520" w:lineRule="exact"/>
-              <w:contextualSpacing/>
-              <w:jc w:val="left"/>
-              <w:rPr>
-                <w:rFonts w:ascii="仿宋" w:hAnsi="仿宋" w:eastAsia="仿宋" w:cs="宋体"/>
-                <w:kern w:val="0"/>
-                <w:szCs w:val="21"/>
-              </w:rPr>
-            </w:pPr>
-            <w:r>
-              <w:rPr>
-                <w:rFonts w:ascii="仿宋" w:hAnsi="仿宋" w:eastAsia="仿宋" w:cs="宋体"/>
-                <w:kern w:val="0"/>
-                <w:szCs w:val="21"/>
-              </w:rPr>
-              <w:t>根据参选人提供的与商务部分业绩对应的代表性视频作品，从作品的</w:t>
-            </w:r>
-            <w:r>
-              <w:rPr>
-                <w:rFonts w:ascii="仿宋" w:hAnsi="仿宋" w:eastAsia="仿宋" w:cs="宋体"/>
-                <w:bCs/>
-                <w:kern w:val="0"/>
-                <w:szCs w:val="21"/>
-              </w:rPr>
-              <w:t>专业性、创意水平、制作精良度、以及与本次演讲比赛项目类型的关联度</w:t>
-            </w:r>
-            <w:r>
-              <w:rPr>
-                <w:rFonts w:ascii="仿宋" w:hAnsi="仿宋" w:eastAsia="仿宋" w:cs="宋体"/>
-                <w:kern w:val="0"/>
-                <w:szCs w:val="21"/>
-              </w:rPr>
-              <w:t>进行综合评定：</w:t>
-            </w:r>
-            <w:r>
-              <w:rPr>
-                <w:rFonts w:ascii="仿宋" w:hAnsi="仿宋" w:eastAsia="仿宋" w:cs="宋体"/>
-                <w:kern w:val="0"/>
-                <w:szCs w:val="21"/>
-              </w:rPr>
-              <w:br w:type="textWrapping"/>
-            </w:r>
-            <w:r>
-              <w:rPr>
-                <w:rFonts w:ascii="仿宋" w:hAnsi="仿宋" w:eastAsia="仿宋" w:cs="宋体"/>
-                <w:bCs/>
-                <w:kern w:val="0"/>
-                <w:szCs w:val="21"/>
-              </w:rPr>
-              <w:t>优秀（</w:t>
-            </w:r>
-            <w:r>
-              <w:rPr>
-                <w:rFonts w:hint="eastAsia" w:ascii="仿宋" w:hAnsi="仿宋" w:eastAsia="仿宋" w:cs="宋体"/>
-                <w:b/>
-                <w:bCs/>
-                <w:kern w:val="0"/>
-                <w:szCs w:val="21"/>
-              </w:rPr>
-              <w:t>5</w:t>
-            </w:r>
-            <w:r>
-              <w:rPr>
-                <w:rFonts w:ascii="仿宋" w:hAnsi="仿宋" w:eastAsia="仿宋" w:cs="宋体"/>
-                <w:bCs/>
-                <w:kern w:val="0"/>
-                <w:szCs w:val="21"/>
-              </w:rPr>
-              <w:t>分）：</w:t>
-            </w:r>
-            <w:r>
-              <w:rPr>
-                <w:rFonts w:ascii="Calibri" w:hAnsi="Calibri" w:eastAsia="仿宋" w:cs="Calibri"/>
-                <w:kern w:val="0"/>
-                <w:szCs w:val="21"/>
-              </w:rPr>
-              <w:t> </w:t>
-            </w:r>
-            <w:r>
-              <w:rPr>
-                <w:rFonts w:ascii="仿宋" w:hAnsi="仿宋" w:eastAsia="仿宋" w:cs="宋体"/>
-                <w:kern w:val="0"/>
-                <w:szCs w:val="21"/>
-              </w:rPr>
-              <w:t>作品整体质量高，与项目类型高度相关，能充分体现其专业能力。</w:t>
-            </w:r>
-            <w:r>
-              <w:rPr>
-                <w:rFonts w:ascii="仿宋" w:hAnsi="仿宋" w:eastAsia="仿宋" w:cs="宋体"/>
-                <w:kern w:val="0"/>
-                <w:szCs w:val="21"/>
-              </w:rPr>
-              <w:br w:type="textWrapping"/>
-            </w:r>
-            <w:r>
-              <w:rPr>
-                <w:rFonts w:ascii="仿宋" w:hAnsi="仿宋" w:eastAsia="仿宋" w:cs="宋体"/>
-                <w:bCs/>
-                <w:kern w:val="0"/>
-                <w:szCs w:val="21"/>
-              </w:rPr>
-              <w:t>良好（</w:t>
-            </w:r>
-            <w:r>
-              <w:rPr>
-                <w:rFonts w:hint="eastAsia" w:ascii="仿宋" w:hAnsi="仿宋" w:eastAsia="仿宋" w:cs="宋体"/>
-                <w:b/>
-                <w:bCs/>
-                <w:kern w:val="0"/>
-                <w:szCs w:val="21"/>
-              </w:rPr>
-              <w:t>3</w:t>
-            </w:r>
-            <w:r>
-              <w:rPr>
-                <w:rFonts w:ascii="仿宋" w:hAnsi="仿宋" w:eastAsia="仿宋" w:cs="宋体"/>
-                <w:bCs/>
-                <w:kern w:val="0"/>
-                <w:szCs w:val="21"/>
-              </w:rPr>
-              <w:t>分）：</w:t>
-            </w:r>
-            <w:r>
-              <w:rPr>
-                <w:rFonts w:ascii="Calibri" w:hAnsi="Calibri" w:eastAsia="仿宋" w:cs="Calibri"/>
-                <w:kern w:val="0"/>
-                <w:szCs w:val="21"/>
-              </w:rPr>
-              <w:t> </w:t>
-            </w:r>
-            <w:r>
-              <w:rPr>
-                <w:rFonts w:ascii="仿宋" w:hAnsi="仿宋" w:eastAsia="仿宋" w:cs="宋体"/>
-                <w:kern w:val="0"/>
-                <w:szCs w:val="21"/>
-              </w:rPr>
-              <w:t>作品质量良好，与项目类型有一定相关性，能体现其专业能力。</w:t>
-            </w:r>
-            <w:r>
-              <w:rPr>
-                <w:rFonts w:ascii="仿宋" w:hAnsi="仿宋" w:eastAsia="仿宋" w:cs="宋体"/>
-                <w:kern w:val="0"/>
-                <w:szCs w:val="21"/>
-              </w:rPr>
-              <w:br w:type="textWrapping"/>
-            </w:r>
-            <w:r>
-              <w:rPr>
-                <w:rFonts w:ascii="仿宋" w:hAnsi="仿宋" w:eastAsia="仿宋" w:cs="宋体"/>
-                <w:bCs/>
-                <w:kern w:val="0"/>
-                <w:szCs w:val="21"/>
-              </w:rPr>
-              <w:t>一般（</w:t>
-            </w:r>
-            <w:r>
-              <w:rPr>
-                <w:rFonts w:hint="eastAsia" w:ascii="仿宋" w:hAnsi="仿宋" w:eastAsia="仿宋" w:cs="宋体"/>
-                <w:b/>
-                <w:bCs/>
-                <w:kern w:val="0"/>
-                <w:szCs w:val="21"/>
-              </w:rPr>
-              <w:t>1</w:t>
-            </w:r>
-            <w:r>
-              <w:rPr>
-                <w:rFonts w:ascii="仿宋" w:hAnsi="仿宋" w:eastAsia="仿宋" w:cs="宋体"/>
-                <w:bCs/>
-                <w:kern w:val="0"/>
-                <w:szCs w:val="21"/>
-              </w:rPr>
-              <w:t>分）：</w:t>
-            </w:r>
-            <w:r>
-              <w:rPr>
-                <w:rFonts w:ascii="Calibri" w:hAnsi="Calibri" w:eastAsia="仿宋" w:cs="Calibri"/>
-                <w:kern w:val="0"/>
-                <w:szCs w:val="21"/>
-              </w:rPr>
-              <w:t> </w:t>
-            </w:r>
-            <w:r>
-              <w:rPr>
-                <w:rFonts w:ascii="仿宋" w:hAnsi="仿宋" w:eastAsia="仿宋" w:cs="宋体"/>
-                <w:kern w:val="0"/>
-                <w:szCs w:val="21"/>
-              </w:rPr>
-              <w:t>作品质量一般，或与项目类型关联度较低。</w:t>
-            </w:r>
-            <w:r>
-              <w:rPr>
-                <w:rFonts w:ascii="仿宋" w:hAnsi="仿宋" w:eastAsia="仿宋" w:cs="宋体"/>
-                <w:kern w:val="0"/>
-                <w:szCs w:val="21"/>
-              </w:rPr>
-              <w:br w:type="textWrapping"/>
-            </w:r>
-            <w:r>
-              <w:rPr>
-                <w:rFonts w:ascii="仿宋" w:hAnsi="仿宋" w:eastAsia="仿宋" w:cs="宋体"/>
-                <w:bCs/>
-                <w:kern w:val="0"/>
-                <w:szCs w:val="21"/>
-              </w:rPr>
-              <w:t>较差（</w:t>
-            </w:r>
-            <w:r>
-              <w:rPr>
-                <w:rFonts w:ascii="仿宋" w:hAnsi="仿宋" w:eastAsia="仿宋" w:cs="宋体"/>
-                <w:b/>
-                <w:bCs/>
-                <w:kern w:val="0"/>
-                <w:szCs w:val="21"/>
-              </w:rPr>
-              <w:t>0</w:t>
-            </w:r>
-            <w:r>
-              <w:rPr>
-                <w:rFonts w:ascii="仿宋" w:hAnsi="仿宋" w:eastAsia="仿宋" w:cs="宋体"/>
-                <w:bCs/>
-                <w:kern w:val="0"/>
-                <w:szCs w:val="21"/>
-              </w:rPr>
-              <w:t>分）：</w:t>
-            </w:r>
-            <w:r>
-              <w:rPr>
-                <w:rFonts w:ascii="Calibri" w:hAnsi="Calibri" w:eastAsia="仿宋" w:cs="Calibri"/>
-                <w:kern w:val="0"/>
-                <w:szCs w:val="21"/>
-              </w:rPr>
-              <w:t> </w:t>
-            </w:r>
-            <w:r>
-              <w:rPr>
-                <w:rFonts w:ascii="仿宋" w:hAnsi="仿宋" w:eastAsia="仿宋" w:cs="宋体"/>
-                <w:kern w:val="0"/>
-                <w:szCs w:val="21"/>
-              </w:rPr>
-              <w:t>作品质量差，或无法提供有效案例。</w:t>
+            <w:r>
+              <w:t>依据比选文件"五、服务内容及服务范围（四）服务保障措施"，对参选人以下承诺与措施进行综合评定：</w:t>
+            </w:r>
+          </w:p>
+          <w:p>
+            <w:r>
+              <w:t>① 7*24小时技术支持（含节假日）、系统故障1小时内电话响应、必要时4小时内赶到现场排除故障的承诺；</w:t>
+            </w:r>
+          </w:p>
+          <w:p>
+            <w:r>
+              <w:t>② 指定专人负责与医院运维对接；系统功能变动需求以文档/邮件形式通知，阶段性维护工作在运维工作任务单上双方签字确认的管理机制。</w:t>
+            </w:r>
+          </w:p>
+          <w:p>
+            <w:r>
+              <w:t>优秀（10分）： 承诺与机制具体、可验证、可执行；良好（7分）： 承诺与机制较具体；</w:t>
+            </w:r>
+          </w:p>
+          <w:p>
+            <w:r>
+              <w:t>一般（4分）： 承诺基本满足要求；较差（0分）： 承诺不满足要求或无可执行机制。</w:t>
             </w:r>
           </w:p>
         </w:tc>
@@ -30839,26 +28185,8 @@
             <w:vAlign w:val="center"/>
           </w:tcPr>
           <w:p>
-            <w:pPr>
-              <w:widowControl/>
-              <w:spacing w:line="520" w:lineRule="exact"/>
-              <w:contextualSpacing/>
-              <w:jc w:val="center"/>
-              <w:rPr>
-                <w:rFonts w:ascii="仿宋" w:hAnsi="仿宋" w:eastAsia="仿宋" w:cs="宋体"/>
-                <w:kern w:val="0"/>
-                <w:szCs w:val="21"/>
-              </w:rPr>
-            </w:pPr>
-            <w:r>
-              <w:rPr>
-                <w:rFonts w:hint="eastAsia" w:ascii="仿宋" w:hAnsi="仿宋" w:eastAsia="仿宋" w:cs="宋体"/>
-                <w:b/>
-                <w:bCs/>
-                <w:kern w:val="0"/>
-                <w:szCs w:val="21"/>
-              </w:rPr>
-              <w:t>5</w:t>
+            <w:r>
+              <w:t>10</w:t>
             </w:r>
           </w:p>
         </w:tc>
@@ -30874,23 +28202,7 @@
             <w:vAlign w:val="center"/>
           </w:tcPr>
           <w:p>
-            <w:pPr>
-              <w:widowControl/>
-              <w:spacing w:line="520" w:lineRule="exact"/>
-              <w:contextualSpacing/>
-              <w:jc w:val="center"/>
-              <w:rPr>
-                <w:rFonts w:ascii="仿宋" w:hAnsi="仿宋" w:eastAsia="仿宋" w:cs="宋体"/>
-                <w:kern w:val="0"/>
-                <w:szCs w:val="21"/>
-              </w:rPr>
-            </w:pPr>
-            <w:r>
-              <w:rPr>
-                <w:rFonts w:ascii="仿宋" w:hAnsi="仿宋" w:eastAsia="仿宋" w:cs="宋体"/>
-                <w:kern w:val="0"/>
-                <w:szCs w:val="21"/>
-              </w:rPr>
+            <w:r>
               <w:t>主观</w:t>
             </w:r>
           </w:p>
@@ -30925,17 +28237,7 @@
             <w:vAlign w:val="center"/>
           </w:tcPr>
           <w:p>
-            <w:pPr>
-              <w:widowControl/>
-              <w:spacing w:line="520" w:lineRule="exact"/>
-              <w:contextualSpacing/>
-              <w:jc w:val="center"/>
-              <w:rPr>
-                <w:rFonts w:ascii="仿宋" w:hAnsi="仿宋" w:eastAsia="仿宋" w:cs="宋体"/>
-                <w:kern w:val="0"/>
-                <w:szCs w:val="21"/>
-              </w:rPr>
-            </w:pPr>
+            <w:r/>
           </w:p>
         </w:tc>
         <w:tc>
@@ -30950,27 +28252,7 @@
             <w:vAlign w:val="center"/>
           </w:tcPr>
           <w:p>
-            <w:pPr>
-              <w:widowControl/>
-              <w:spacing w:line="520" w:lineRule="exact"/>
-              <w:contextualSpacing/>
-              <w:jc w:val="center"/>
-              <w:rPr>
-                <w:rFonts w:ascii="仿宋" w:hAnsi="仿宋" w:eastAsia="仿宋" w:cs="宋体"/>
-                <w:bCs/>
-                <w:kern w:val="0"/>
-                <w:szCs w:val="21"/>
-              </w:rPr>
-            </w:pPr>
-            <w:r>
-              <w:rPr>
-                <w:rFonts w:hint="eastAsia" w:ascii="仿宋" w:hAnsi="仿宋" w:eastAsia="仿宋" w:cs="宋体"/>
-                <w:bCs/>
-                <w:kern w:val="0"/>
-                <w:szCs w:val="21"/>
-              </w:rPr>
-              <w:t>售后服务方案</w:t>
-            </w:r>
+            <w:r/>
           </w:p>
         </w:tc>
         <w:tc>
@@ -30985,308 +28267,7 @@
             <w:vAlign w:val="center"/>
           </w:tcPr>
           <w:p>
-            <w:pPr>
-              <w:widowControl/>
-              <w:spacing w:line="360" w:lineRule="auto"/>
-              <w:rPr>
-                <w:rFonts w:ascii="仿宋" w:hAnsi="仿宋" w:eastAsia="仿宋" w:cs="宋体"/>
-                <w:szCs w:val="21"/>
-              </w:rPr>
-            </w:pPr>
-            <w:r>
-              <w:rPr>
-                <w:rFonts w:ascii="仿宋" w:hAnsi="仿宋" w:eastAsia="仿宋" w:cs="宋体"/>
-                <w:szCs w:val="21"/>
-              </w:rPr>
-              <w:t>根据供应商提供的</w:t>
-            </w:r>
-            <w:r>
-              <w:rPr>
-                <w:rFonts w:hint="eastAsia" w:ascii="仿宋" w:hAnsi="仿宋" w:eastAsia="仿宋" w:cs="宋体"/>
-                <w:szCs w:val="21"/>
-              </w:rPr>
-              <w:t>“售后服务方案”</w:t>
-            </w:r>
-            <w:r>
-              <w:rPr>
-                <w:rFonts w:ascii="仿宋" w:hAnsi="仿宋" w:eastAsia="仿宋" w:cs="宋体"/>
-                <w:szCs w:val="21"/>
-              </w:rPr>
-              <w:t>进行综合评审：</w:t>
-            </w:r>
-          </w:p>
-          <w:p>
-            <w:pPr>
-              <w:widowControl/>
-              <w:spacing w:line="360" w:lineRule="auto"/>
-              <w:rPr>
-                <w:rFonts w:ascii="仿宋" w:hAnsi="仿宋" w:eastAsia="仿宋" w:cs="宋体"/>
-                <w:szCs w:val="21"/>
-              </w:rPr>
-            </w:pPr>
-            <w:r>
-              <w:rPr>
-                <w:rFonts w:ascii="仿宋" w:hAnsi="仿宋" w:eastAsia="仿宋" w:cs="宋体"/>
-                <w:bCs/>
-                <w:kern w:val="0"/>
-                <w:szCs w:val="21"/>
-              </w:rPr>
-              <w:t>优秀（</w:t>
-            </w:r>
-            <w:r>
-              <w:rPr>
-                <w:rFonts w:hint="eastAsia" w:ascii="仿宋" w:hAnsi="仿宋" w:eastAsia="仿宋" w:cs="宋体"/>
-                <w:bCs/>
-                <w:kern w:val="0"/>
-                <w:szCs w:val="21"/>
-              </w:rPr>
-              <w:t>5</w:t>
-            </w:r>
-            <w:r>
-              <w:rPr>
-                <w:rFonts w:ascii="仿宋" w:hAnsi="仿宋" w:eastAsia="仿宋" w:cs="宋体"/>
-                <w:bCs/>
-                <w:kern w:val="0"/>
-                <w:szCs w:val="21"/>
-              </w:rPr>
-              <w:t>分）：</w:t>
-            </w:r>
-            <w:r>
-              <w:rPr>
-                <w:rFonts w:ascii="Calibri" w:hAnsi="Calibri" w:eastAsia="仿宋" w:cs="Calibri"/>
-                <w:kern w:val="0"/>
-                <w:szCs w:val="21"/>
-              </w:rPr>
-              <w:t> </w:t>
-            </w:r>
-            <w:r>
-              <w:rPr>
-                <w:rFonts w:hint="eastAsia" w:ascii="仿宋" w:hAnsi="仿宋" w:eastAsia="仿宋" w:cs="宋体"/>
-                <w:szCs w:val="21"/>
-              </w:rPr>
-              <w:t>售后服务</w:t>
-            </w:r>
-            <w:r>
-              <w:rPr>
-                <w:rFonts w:ascii="仿宋" w:hAnsi="仿宋" w:eastAsia="仿宋" w:cs="宋体"/>
-                <w:szCs w:val="21"/>
-              </w:rPr>
-              <w:t>方案科学合理，反应速度快，可执行性强</w:t>
-            </w:r>
-            <w:r>
-              <w:rPr>
-                <w:rFonts w:hint="eastAsia" w:ascii="仿宋" w:hAnsi="仿宋" w:eastAsia="仿宋" w:cs="宋体"/>
-                <w:szCs w:val="21"/>
-              </w:rPr>
-              <w:t>。</w:t>
-            </w:r>
-          </w:p>
-          <w:p>
-            <w:pPr>
-              <w:widowControl/>
-              <w:spacing w:line="360" w:lineRule="auto"/>
-              <w:rPr>
-                <w:rFonts w:ascii="仿宋" w:hAnsi="仿宋" w:eastAsia="仿宋" w:cs="宋体"/>
-                <w:szCs w:val="21"/>
-              </w:rPr>
-            </w:pPr>
-            <w:r>
-              <w:rPr>
-                <w:rFonts w:ascii="仿宋" w:hAnsi="仿宋" w:eastAsia="仿宋" w:cs="宋体"/>
-                <w:bCs/>
-                <w:kern w:val="0"/>
-                <w:szCs w:val="21"/>
-              </w:rPr>
-              <w:t>良好（</w:t>
-            </w:r>
-            <w:r>
-              <w:rPr>
-                <w:rFonts w:hint="eastAsia" w:ascii="仿宋" w:hAnsi="仿宋" w:eastAsia="仿宋" w:cs="宋体"/>
-                <w:bCs/>
-                <w:kern w:val="0"/>
-                <w:szCs w:val="21"/>
-              </w:rPr>
-              <w:t>3</w:t>
-            </w:r>
-            <w:r>
-              <w:rPr>
-                <w:rFonts w:ascii="仿宋" w:hAnsi="仿宋" w:eastAsia="仿宋" w:cs="宋体"/>
-                <w:bCs/>
-                <w:kern w:val="0"/>
-                <w:szCs w:val="21"/>
-              </w:rPr>
-              <w:t>分）：</w:t>
-            </w:r>
-            <w:r>
-              <w:rPr>
-                <w:rFonts w:ascii="Calibri" w:hAnsi="Calibri" w:eastAsia="仿宋" w:cs="Calibri"/>
-                <w:kern w:val="0"/>
-                <w:szCs w:val="21"/>
-              </w:rPr>
-              <w:t> </w:t>
-            </w:r>
-            <w:r>
-              <w:rPr>
-                <w:rFonts w:hint="eastAsia" w:ascii="仿宋" w:hAnsi="仿宋" w:eastAsia="仿宋" w:cs="宋体"/>
-                <w:szCs w:val="21"/>
-              </w:rPr>
-              <w:t>售后服务</w:t>
-            </w:r>
-            <w:r>
-              <w:rPr>
-                <w:rFonts w:ascii="仿宋" w:hAnsi="仿宋" w:eastAsia="仿宋" w:cs="宋体"/>
-                <w:szCs w:val="21"/>
-              </w:rPr>
-              <w:t>方案较科学合理，反应速度较快，可执行性较强</w:t>
-            </w:r>
-            <w:r>
-              <w:rPr>
-                <w:rFonts w:hint="eastAsia" w:ascii="仿宋" w:hAnsi="仿宋" w:eastAsia="仿宋" w:cs="宋体"/>
-                <w:szCs w:val="21"/>
-              </w:rPr>
-              <w:t>。</w:t>
-            </w:r>
-          </w:p>
-          <w:p>
-            <w:pPr>
-              <w:widowControl/>
-              <w:spacing w:line="360" w:lineRule="auto"/>
-              <w:rPr>
-                <w:rFonts w:ascii="仿宋" w:hAnsi="仿宋" w:eastAsia="仿宋" w:cs="宋体"/>
-                <w:szCs w:val="21"/>
-              </w:rPr>
-            </w:pPr>
-            <w:r>
-              <w:rPr>
-                <w:rFonts w:ascii="仿宋" w:hAnsi="仿宋" w:eastAsia="仿宋" w:cs="宋体"/>
-                <w:bCs/>
-                <w:kern w:val="0"/>
-                <w:szCs w:val="21"/>
-              </w:rPr>
-              <w:t>一般（</w:t>
-            </w:r>
-            <w:r>
-              <w:rPr>
-                <w:rFonts w:hint="eastAsia" w:ascii="仿宋" w:hAnsi="仿宋" w:eastAsia="仿宋" w:cs="宋体"/>
-                <w:bCs/>
-                <w:kern w:val="0"/>
-                <w:szCs w:val="21"/>
-              </w:rPr>
-              <w:t>1</w:t>
-            </w:r>
-            <w:r>
-              <w:rPr>
-                <w:rFonts w:ascii="仿宋" w:hAnsi="仿宋" w:eastAsia="仿宋" w:cs="宋体"/>
-                <w:bCs/>
-                <w:kern w:val="0"/>
-                <w:szCs w:val="21"/>
-              </w:rPr>
-              <w:t>分）：</w:t>
-            </w:r>
-            <w:r>
-              <w:rPr>
-                <w:rFonts w:hint="eastAsia" w:ascii="仿宋" w:hAnsi="仿宋" w:eastAsia="仿宋" w:cs="宋体"/>
-                <w:szCs w:val="21"/>
-              </w:rPr>
-              <w:t>售后服务</w:t>
-            </w:r>
-            <w:r>
-              <w:rPr>
-                <w:rFonts w:ascii="仿宋" w:hAnsi="仿宋" w:eastAsia="仿宋" w:cs="宋体"/>
-                <w:szCs w:val="21"/>
-              </w:rPr>
-              <w:t>方案一般科学合理，反应速度一般，基本具备可行性</w:t>
-            </w:r>
-            <w:r>
-              <w:rPr>
-                <w:rFonts w:hint="eastAsia" w:ascii="仿宋" w:hAnsi="仿宋" w:eastAsia="仿宋" w:cs="宋体"/>
-                <w:szCs w:val="21"/>
-              </w:rPr>
-              <w:t>。</w:t>
-            </w:r>
-          </w:p>
-          <w:p>
-            <w:pPr>
-              <w:widowControl/>
-              <w:spacing w:line="360" w:lineRule="auto"/>
-              <w:contextualSpacing/>
-              <w:jc w:val="left"/>
-              <w:rPr>
-                <w:rFonts w:ascii="仿宋" w:hAnsi="仿宋" w:eastAsia="仿宋" w:cs="宋体"/>
-                <w:kern w:val="0"/>
-                <w:szCs w:val="21"/>
-              </w:rPr>
-            </w:pPr>
-            <w:r>
-              <w:rPr>
-                <w:rFonts w:ascii="仿宋" w:hAnsi="仿宋" w:eastAsia="仿宋" w:cs="宋体"/>
-                <w:bCs/>
-                <w:kern w:val="0"/>
-                <w:szCs w:val="21"/>
-              </w:rPr>
-              <w:t>较差（</w:t>
-            </w:r>
-            <w:r>
-              <w:rPr>
-                <w:rFonts w:ascii="仿宋" w:hAnsi="仿宋" w:eastAsia="仿宋" w:cs="宋体"/>
-                <w:b/>
-                <w:bCs/>
-                <w:kern w:val="0"/>
-                <w:szCs w:val="21"/>
-              </w:rPr>
-              <w:t>0</w:t>
-            </w:r>
-            <w:r>
-              <w:rPr>
-                <w:rFonts w:ascii="仿宋" w:hAnsi="仿宋" w:eastAsia="仿宋" w:cs="宋体"/>
-                <w:bCs/>
-                <w:kern w:val="0"/>
-                <w:szCs w:val="21"/>
-              </w:rPr>
-              <w:t>分）：</w:t>
-            </w:r>
-            <w:r>
-              <w:rPr>
-                <w:rFonts w:ascii="仿宋" w:hAnsi="仿宋" w:eastAsia="仿宋" w:cs="宋体"/>
-                <w:szCs w:val="21"/>
-              </w:rPr>
-              <w:t>未提供</w:t>
-            </w:r>
-            <w:r>
-              <w:rPr>
-                <w:rFonts w:hint="eastAsia" w:ascii="仿宋" w:hAnsi="仿宋" w:eastAsia="仿宋" w:cs="宋体"/>
-                <w:szCs w:val="21"/>
-              </w:rPr>
-              <w:t>售后服务</w:t>
-            </w:r>
-            <w:r>
-              <w:rPr>
-                <w:rFonts w:ascii="仿宋" w:hAnsi="仿宋" w:eastAsia="仿宋" w:cs="宋体"/>
-                <w:szCs w:val="21"/>
-              </w:rPr>
-              <w:t>方案或</w:t>
-            </w:r>
-            <w:r>
-              <w:rPr>
-                <w:rFonts w:hint="eastAsia" w:ascii="仿宋" w:hAnsi="仿宋" w:eastAsia="仿宋" w:cs="宋体"/>
-                <w:szCs w:val="21"/>
-              </w:rPr>
-              <w:t>售后服务</w:t>
-            </w:r>
-            <w:r>
-              <w:rPr>
-                <w:rFonts w:ascii="仿宋" w:hAnsi="仿宋" w:eastAsia="仿宋" w:cs="宋体"/>
-                <w:szCs w:val="21"/>
-              </w:rPr>
-              <w:t>方案不合理，内容缺失较多，或未提供的</w:t>
-            </w:r>
-            <w:r>
-              <w:rPr>
-                <w:rFonts w:hint="eastAsia" w:ascii="仿宋" w:hAnsi="仿宋" w:eastAsia="仿宋" w:cs="宋体"/>
-                <w:szCs w:val="21"/>
-              </w:rPr>
-              <w:t>。</w:t>
-            </w:r>
+            <w:r/>
           </w:p>
         </w:tc>
         <w:tc>
@@ -31301,29 +28282,7 @@
             <w:vAlign w:val="center"/>
           </w:tcPr>
           <w:p>
-            <w:pPr>
-              <w:widowControl/>
-              <w:spacing w:line="520" w:lineRule="exact"/>
-              <w:contextualSpacing/>
-              <w:jc w:val="center"/>
-              <w:rPr>
-                <w:rFonts w:ascii="仿宋" w:hAnsi="仿宋" w:eastAsia="仿宋" w:cs="宋体"/>
-                <w:b/>
-                <w:bCs/>
-                <w:kern w:val="0"/>
-                <w:szCs w:val="21"/>
-              </w:rPr>
-            </w:pPr>
-            <w:r>
-              <w:rPr>
-                <w:rFonts w:hint="eastAsia" w:ascii="仿宋" w:hAnsi="仿宋" w:eastAsia="仿宋" w:cs="宋体"/>
-                <w:b/>
-                <w:bCs/>
-                <w:kern w:val="0"/>
-                <w:szCs w:val="21"/>
-              </w:rPr>
-              <w:t>5</w:t>
-            </w:r>
+            <w:r/>
           </w:p>
         </w:tc>
         <w:tc>
@@ -31338,25 +28297,7 @@
             <w:vAlign w:val="center"/>
           </w:tcPr>
           <w:p>
-            <w:pPr>
-              <w:widowControl/>
-              <w:spacing w:line="520" w:lineRule="exact"/>
-              <w:contextualSpacing/>
-              <w:jc w:val="center"/>
-              <w:rPr>
-                <w:rFonts w:ascii="仿宋" w:hAnsi="仿宋" w:eastAsia="仿宋" w:cs="宋体"/>
-                <w:kern w:val="0"/>
-                <w:szCs w:val="21"/>
-              </w:rPr>
-            </w:pPr>
-            <w:r>
-              <w:rPr>
-                <w:rFonts w:ascii="仿宋" w:hAnsi="仿宋" w:eastAsia="仿宋" w:cs="宋体"/>
-                <w:kern w:val="0"/>
-                <w:szCs w:val="21"/>
-              </w:rPr>
-              <w:t>主观</w:t>
-            </w:r>
+            <w:r/>
           </w:p>
         </w:tc>
       </w:tr>
@@ -31389,24 +28330,7 @@
             <w:vAlign w:val="center"/>
           </w:tcPr>
           <w:p>
-            <w:pPr>
-              <w:widowControl/>
-              <w:spacing w:line="520" w:lineRule="exact"/>
-              <w:contextualSpacing/>
-              <w:jc w:val="center"/>
-              <w:rPr>
-                <w:rFonts w:ascii="仿宋" w:hAnsi="仿宋" w:eastAsia="仿宋" w:cs="宋体"/>
-                <w:kern w:val="0"/>
-                <w:szCs w:val="21"/>
-              </w:rPr>
-            </w:pPr>
-            <w:r>
-              <w:rPr>
-                <w:rFonts w:ascii="仿宋" w:hAnsi="仿宋" w:eastAsia="仿宋" w:cs="宋体"/>
-                <w:bCs/>
-                <w:kern w:val="0"/>
-                <w:szCs w:val="21"/>
-              </w:rPr>
+            <w:r>
               <w:t>总评分</w:t>
             </w:r>
           </w:p>
@@ -31423,17 +28347,7 @@
             <w:vAlign w:val="center"/>
           </w:tcPr>
           <w:p>
-            <w:pPr>
-              <w:widowControl/>
-              <w:spacing w:line="520" w:lineRule="exact"/>
-              <w:contextualSpacing/>
-              <w:jc w:val="center"/>
-              <w:rPr>
-                <w:rFonts w:ascii="仿宋" w:hAnsi="仿宋" w:eastAsia="仿宋" w:cs="宋体"/>
-                <w:kern w:val="0"/>
-                <w:szCs w:val="21"/>
-              </w:rPr>
-            </w:pPr>
+            <w:r/>
           </w:p>
         </w:tc>
         <w:tc>
@@ -31448,17 +28362,9 @@
             <w:vAlign w:val="center"/>
           </w:tcPr>
           <w:p>
-            <w:pPr>
-              <w:widowControl/>
-              <w:spacing w:line="520" w:lineRule="exact"/>
-              <w:contextualSpacing/>
-              <w:jc w:val="center"/>
-              <w:rPr>
-                <w:rFonts w:ascii="仿宋" w:hAnsi="仿宋" w:eastAsia="仿宋" w:cs="宋体"/>
-                <w:kern w:val="0"/>
-                <w:szCs w:val="21"/>
-              </w:rPr>
-            </w:pPr>
+            <w:r>
+              <w:t>价格部分 10 分 + 商务部分 35 分 + 技术部分 55 分</w:t>
+            </w:r>
           </w:p>
         </w:tc>
         <w:tc>
@@ -31473,24 +28379,7 @@
             <w:vAlign w:val="center"/>
           </w:tcPr>
           <w:p>
-            <w:pPr>
-              <w:widowControl/>
-              <w:spacing w:line="520" w:lineRule="exact"/>
-              <w:contextualSpacing/>
-              <w:jc w:val="center"/>
-              <w:rPr>
-                <w:rFonts w:ascii="仿宋" w:hAnsi="仿宋" w:eastAsia="仿宋" w:cs="宋体"/>
-                <w:kern w:val="0"/>
-                <w:szCs w:val="21"/>
-              </w:rPr>
-            </w:pPr>
-            <w:r>
-              <w:rPr>
-                <w:rFonts w:ascii="仿宋" w:hAnsi="仿宋" w:eastAsia="仿宋" w:cs="宋体"/>
-                <w:bCs/>
-                <w:kern w:val="0"/>
-                <w:szCs w:val="21"/>
-              </w:rPr>
+            <w:r>
               <w:t>100分</w:t>
             </w:r>
           </w:p>
@@ -31507,17 +28396,7 @@
             <w:vAlign w:val="center"/>
           </w:tcPr>
           <w:p>
-            <w:pPr>
-              <w:widowControl/>
-              <w:spacing w:line="520" w:lineRule="exact"/>
-              <w:contextualSpacing/>
-              <w:jc w:val="left"/>
-              <w:rPr>
-                <w:rFonts w:ascii="仿宋" w:hAnsi="仿宋" w:eastAsia="仿宋"/>
-                <w:kern w:val="0"/>
-                <w:szCs w:val="21"/>
-              </w:rPr>
-            </w:pPr>
+            <w:r/>
           </w:p>
         </w:tc>
       </w:tr>

</xml_diff>